<commit_message>
feat: zálohovací skripty pro produkční server
scripts/backup.sh — denní záloha DB (pg_dump), media a .env.production
s rotací 7 dní; připraven volitelný offsite rsync na Hetzner Storage Box.
scripts/restore.sh — interaktivní obnova dat ze zálohy.

Co-Authored-By: Claude Sonnet 4.6 <noreply@anthropic.com>
</commit_message>
<xml_diff>
--- a/HCV_Helpdesk.docx
+++ b/HCV_Helpdesk.docx
@@ -2,7 +2,7 @@
 <file path=word/document.xml><?xml version="1.0" encoding="utf-8"?>
 <w:document xmlns:w="http://schemas.openxmlformats.org/wordprocessingml/2006/main" xmlns:m="http://schemas.openxmlformats.org/officeDocument/2006/math" xmlns:r="http://schemas.openxmlformats.org/officeDocument/2006/relationships" xmlns:o="urn:schemas-microsoft-com:office:office" xmlns:v="urn:schemas-microsoft-com:vml" xmlns:w10="urn:schemas-microsoft-com:office:word" xmlns:a="http://schemas.openxmlformats.org/drawingml/2006/main" xmlns:pic="http://schemas.openxmlformats.org/drawingml/2006/picture" xmlns:wp="http://schemas.openxmlformats.org/drawingml/2006/wordprocessingDrawing">
   <w:body>
-    <w:bookmarkStart w:id="20" w:name="hcv-helpdesk"/>
+    <w:bookmarkStart w:id="24" w:name="hcv-helpdesk"/>
     <w:p>
       <w:pPr>
         <w:pStyle w:val="Heading1"/>
@@ -216,7 +216,79 @@
         </w:numPr>
       </w:pPr>
       <w:r>
-        <w:t xml:space="preserve">Vidí pouze požadavky, které sám založil</w:t>
+        <w:t xml:space="preserve">Rozsah viditelnosti tiketů se nastavuje per-uživatel (administrátorem):</w:t>
+      </w:r>
+    </w:p>
+    <w:p>
+      <w:pPr>
+        <w:pStyle w:val="Compact"/>
+        <w:numPr>
+          <w:ilvl w:val="2"/>
+          <w:numId w:val="1004"/>
+        </w:numPr>
+      </w:pPr>
+      <w:r>
+        <w:rPr>
+          <w:b/>
+          <w:bCs/>
+        </w:rPr>
+        <w:t xml:space="preserve">Pouze vlastní tikety</w:t>
+      </w:r>
+      <w:r>
+        <w:t xml:space="preserve"> </w:t>
+      </w:r>
+      <w:r>
+        <w:t xml:space="preserve">(výchozí) — vidí jen tikety, které sám založil</w:t>
+      </w:r>
+    </w:p>
+    <w:p>
+      <w:pPr>
+        <w:pStyle w:val="Compact"/>
+        <w:numPr>
+          <w:ilvl w:val="2"/>
+          <w:numId w:val="1004"/>
+        </w:numPr>
+      </w:pPr>
+      <w:r>
+        <w:rPr>
+          <w:b/>
+          <w:bCs/>
+        </w:rPr>
+        <w:t xml:space="preserve">Všechny tikety firmy</w:t>
+      </w:r>
+      <w:r>
+        <w:t xml:space="preserve"> </w:t>
+      </w:r>
+      <w:r>
+        <w:t xml:space="preserve">— vidí všechny tikety své firmy</w:t>
+      </w:r>
+    </w:p>
+    <w:p>
+      <w:pPr>
+        <w:pStyle w:val="Compact"/>
+        <w:numPr>
+          <w:ilvl w:val="2"/>
+          <w:numId w:val="1004"/>
+        </w:numPr>
+      </w:pPr>
+      <w:r>
+        <w:rPr>
+          <w:b/>
+          <w:bCs/>
+        </w:rPr>
+        <w:t xml:space="preserve">Tikety firmy v konkrétních oblastech</w:t>
+      </w:r>
+      <w:r>
+        <w:t xml:space="preserve"> </w:t>
+      </w:r>
+      <w:r>
+        <w:t xml:space="preserve">— vidí tikety firmy v zadaných</w:t>
+      </w:r>
+      <w:r>
+        <w:t xml:space="preserve"> </w:t>
+      </w:r>
+      <w:r>
+        <w:t xml:space="preserve">oblastech; vlastní tikety jsou vždy viditelné bez ohledu na oblast</w:t>
       </w:r>
     </w:p>
     <w:p>
@@ -227,7 +299,7 @@
         </w:numPr>
       </w:pPr>
       <w:r>
-        <w:t xml:space="preserve">Může komentovat požadavky, které založil</w:t>
+        <w:t xml:space="preserve">Může komentovat pouze tikety, které sám založil (bez ohledu na rozsah viditelnosti)</w:t>
       </w:r>
     </w:p>
     <w:p>
@@ -267,7 +339,7 @@
       <w:pPr>
         <w:numPr>
           <w:ilvl w:val="1"/>
-          <w:numId w:val="1004"/>
+          <w:numId w:val="1005"/>
         </w:numPr>
       </w:pPr>
       <w:r>
@@ -278,7 +350,7 @@
       <w:pPr>
         <w:numPr>
           <w:ilvl w:val="1"/>
-          <w:numId w:val="1004"/>
+          <w:numId w:val="1005"/>
         </w:numPr>
       </w:pPr>
       <w:r>
@@ -313,7 +385,7 @@
       <w:pPr>
         <w:numPr>
           <w:ilvl w:val="1"/>
-          <w:numId w:val="1004"/>
+          <w:numId w:val="1005"/>
         </w:numPr>
       </w:pPr>
       <w:r>
@@ -324,7 +396,7 @@
       <w:pPr>
         <w:numPr>
           <w:ilvl w:val="1"/>
-          <w:numId w:val="1004"/>
+          <w:numId w:val="1005"/>
         </w:numPr>
       </w:pPr>
       <w:r>
@@ -341,17 +413,23 @@
       <w:pPr>
         <w:numPr>
           <w:ilvl w:val="1"/>
-          <w:numId w:val="1004"/>
-        </w:numPr>
-      </w:pPr>
-      <w:r>
-        <w:t xml:space="preserve">Může převzít požadavek ve stavu „Nový” — přiřadí se sám sobě</w:t>
-      </w:r>
-      <w:r>
-        <w:t xml:space="preserve"> </w:t>
-      </w:r>
-      <w:r>
-        <w:t xml:space="preserve">a požadavek přejde do stavu „Řeší se”; převzít lze pouze tiket</w:t>
+          <w:numId w:val="1005"/>
+        </w:numPr>
+      </w:pPr>
+      <w:r>
+        <w:t xml:space="preserve">Může převzít požadavek ve stavu „Nový” nebo „Řeší se” — přiřadí se</w:t>
+      </w:r>
+      <w:r>
+        <w:t xml:space="preserve"> </w:t>
+      </w:r>
+      <w:r>
+        <w:t xml:space="preserve">sám sobě; při převzetí z „Nový” přejde požadavek do stavu „Řeší se”,</w:t>
+      </w:r>
+      <w:r>
+        <w:t xml:space="preserve"> </w:t>
+      </w:r>
+      <w:r>
+        <w:t xml:space="preserve">při převzetí z „Řeší se” se stav nemění; převzít lze pouze tiket</w:t>
       </w:r>
       <w:r>
         <w:t xml:space="preserve"> </w:t>
@@ -364,7 +442,7 @@
       <w:pPr>
         <w:numPr>
           <w:ilvl w:val="1"/>
-          <w:numId w:val="1004"/>
+          <w:numId w:val="1005"/>
         </w:numPr>
       </w:pPr>
       <w:r>
@@ -375,7 +453,7 @@
       <w:pPr>
         <w:numPr>
           <w:ilvl w:val="1"/>
-          <w:numId w:val="1004"/>
+          <w:numId w:val="1005"/>
         </w:numPr>
       </w:pPr>
       <w:r>
@@ -386,7 +464,7 @@
       <w:pPr>
         <w:numPr>
           <w:ilvl w:val="1"/>
-          <w:numId w:val="1004"/>
+          <w:numId w:val="1005"/>
         </w:numPr>
       </w:pPr>
       <w:r>
@@ -403,7 +481,7 @@
       <w:pPr>
         <w:numPr>
           <w:ilvl w:val="1"/>
-          <w:numId w:val="1004"/>
+          <w:numId w:val="1005"/>
         </w:numPr>
       </w:pPr>
       <w:r>
@@ -425,7 +503,7 @@
         <w:t xml:space="preserve"> </w:t>
       </w:r>
       <w:r>
-        <w:t xml:space="preserve">stavech</w:t>
+        <w:t xml:space="preserve">stavech, průměrné hodnocení spokojenosti žadatelů za měsíc</w:t>
       </w:r>
     </w:p>
     <w:p>
@@ -444,7 +522,7 @@
         <w:pStyle w:val="Compact"/>
         <w:numPr>
           <w:ilvl w:val="1"/>
-          <w:numId w:val="1005"/>
+          <w:numId w:val="1006"/>
         </w:numPr>
       </w:pPr>
       <w:r>
@@ -472,7 +550,7 @@
       <w:pPr>
         <w:numPr>
           <w:ilvl w:val="1"/>
-          <w:numId w:val="1006"/>
+          <w:numId w:val="1007"/>
         </w:numPr>
       </w:pPr>
       <w:r>
@@ -483,7 +561,7 @@
       <w:pPr>
         <w:numPr>
           <w:ilvl w:val="1"/>
-          <w:numId w:val="1006"/>
+          <w:numId w:val="1007"/>
         </w:numPr>
       </w:pPr>
       <w:r>
@@ -536,7 +614,7 @@
       <w:pPr>
         <w:numPr>
           <w:ilvl w:val="1"/>
-          <w:numId w:val="1006"/>
+          <w:numId w:val="1007"/>
         </w:numPr>
       </w:pPr>
       <w:r>
@@ -553,7 +631,7 @@
       <w:pPr>
         <w:numPr>
           <w:ilvl w:val="1"/>
-          <w:numId w:val="1006"/>
+          <w:numId w:val="1007"/>
         </w:numPr>
       </w:pPr>
       <w:r>
@@ -564,7 +642,7 @@
       <w:pPr>
         <w:numPr>
           <w:ilvl w:val="1"/>
-          <w:numId w:val="1006"/>
+          <w:numId w:val="1007"/>
         </w:numPr>
       </w:pPr>
       <w:r>
@@ -587,7 +665,7 @@
       <w:pPr>
         <w:numPr>
           <w:ilvl w:val="1"/>
-          <w:numId w:val="1006"/>
+          <w:numId w:val="1007"/>
         </w:numPr>
       </w:pPr>
       <w:r>
@@ -604,7 +682,7 @@
       <w:pPr>
         <w:numPr>
           <w:ilvl w:val="1"/>
-          <w:numId w:val="1006"/>
+          <w:numId w:val="1007"/>
         </w:numPr>
       </w:pPr>
       <w:r>
@@ -621,7 +699,7 @@
       <w:pPr>
         <w:numPr>
           <w:ilvl w:val="1"/>
-          <w:numId w:val="1006"/>
+          <w:numId w:val="1007"/>
         </w:numPr>
       </w:pPr>
       <w:r>
@@ -632,11 +710,17 @@
       <w:pPr>
         <w:numPr>
           <w:ilvl w:val="1"/>
-          <w:numId w:val="1006"/>
-        </w:numPr>
-      </w:pPr>
-      <w:r>
-        <w:t xml:space="preserve">Vidí veškeré statistiky za období (měsíc) – statistiky uživatelů,</w:t>
+          <w:numId w:val="1007"/>
+        </w:numPr>
+      </w:pPr>
+      <w:r>
+        <w:t xml:space="preserve">Vidí veškeré statistiky za období (měsíc) – statistiky uživatelů</w:t>
+      </w:r>
+      <w:r>
+        <w:t xml:space="preserve"> </w:t>
+      </w:r>
+      <w:r>
+        <w:t xml:space="preserve">(včetně průměrného hodnocení spokojenosti každého řešitele),</w:t>
       </w:r>
       <w:r>
         <w:t xml:space="preserve"> </w:t>
@@ -666,7 +750,7 @@
       <w:pPr>
         <w:numPr>
           <w:ilvl w:val="1"/>
-          <w:numId w:val="1007"/>
+          <w:numId w:val="1008"/>
         </w:numPr>
       </w:pPr>
       <w:r>
@@ -677,7 +761,7 @@
       <w:pPr>
         <w:numPr>
           <w:ilvl w:val="1"/>
-          <w:numId w:val="1007"/>
+          <w:numId w:val="1008"/>
         </w:numPr>
       </w:pPr>
       <w:r>
@@ -688,7 +772,7 @@
       <w:pPr>
         <w:numPr>
           <w:ilvl w:val="1"/>
-          <w:numId w:val="1007"/>
+          <w:numId w:val="1008"/>
         </w:numPr>
       </w:pPr>
       <w:r>
@@ -699,7 +783,7 @@
       <w:pPr>
         <w:numPr>
           <w:ilvl w:val="1"/>
-          <w:numId w:val="1007"/>
+          <w:numId w:val="1008"/>
         </w:numPr>
       </w:pPr>
       <w:r>
@@ -710,18 +794,53 @@
       <w:pPr>
         <w:numPr>
           <w:ilvl w:val="1"/>
-          <w:numId w:val="1007"/>
-        </w:numPr>
-      </w:pPr>
-      <w:r>
-        <w:t xml:space="preserve">Zakládá a spravuje oblasti (název, příznak „neznámá”)</w:t>
+          <w:numId w:val="1008"/>
+        </w:numPr>
+      </w:pPr>
+      <w:r>
+        <w:t xml:space="preserve">Zakládá a spravuje oblasti (název, příznak „neznámá”); v přehledu</w:t>
+      </w:r>
+      <w:r>
+        <w:t xml:space="preserve"> </w:t>
+      </w:r>
+      <w:r>
+        <w:t xml:space="preserve">oblastí vidí, které kategorie práce jsou k dané oblasti přiřazeny;</w:t>
+      </w:r>
+      <w:r>
+        <w:t xml:space="preserve"> </w:t>
+      </w:r>
+      <w:r>
+        <w:t xml:space="preserve">při editaci oblasti může přímo přiřadit existující kategorie nebo</w:t>
+      </w:r>
+      <w:r>
+        <w:t xml:space="preserve"> </w:t>
+      </w:r>
+      <w:r>
+        <w:t xml:space="preserve">vytvořit novou</w:t>
       </w:r>
     </w:p>
     <w:p>
       <w:pPr>
         <w:numPr>
           <w:ilvl w:val="1"/>
-          <w:numId w:val="1007"/>
+          <w:numId w:val="1008"/>
+        </w:numPr>
+      </w:pPr>
+      <w:r>
+        <w:t xml:space="preserve">Zakládá a spravuje kategorie práce (název, seznam oblastí) přes</w:t>
+      </w:r>
+      <w:r>
+        <w:t xml:space="preserve"> </w:t>
+      </w:r>
+      <w:r>
+        <w:t xml:space="preserve">webové rozhraní (stránka „Kategorie práce” v menu)</w:t>
+      </w:r>
+    </w:p>
+    <w:p>
+      <w:pPr>
+        <w:numPr>
+          <w:ilvl w:val="1"/>
+          <w:numId w:val="1008"/>
         </w:numPr>
       </w:pPr>
       <w:r>
@@ -744,7 +863,7 @@
       <w:pPr>
         <w:numPr>
           <w:ilvl w:val="1"/>
-          <w:numId w:val="1007"/>
+          <w:numId w:val="1008"/>
         </w:numPr>
       </w:pPr>
       <w:r>
@@ -755,6 +874,29 @@
       </w:r>
       <w:r>
         <w:t xml:space="preserve">(pole se zobrazí pouze pokud má uživatel přiřazenu roli Řešitel)</w:t>
+      </w:r>
+    </w:p>
+    <w:p>
+      <w:pPr>
+        <w:numPr>
+          <w:ilvl w:val="1"/>
+          <w:numId w:val="1008"/>
+        </w:numPr>
+      </w:pPr>
+      <w:r>
+        <w:t xml:space="preserve">Nastavuje rozsah viditelnosti tiketů žadatelům přímo na stránce</w:t>
+      </w:r>
+      <w:r>
+        <w:t xml:space="preserve"> </w:t>
+      </w:r>
+      <w:r>
+        <w:t xml:space="preserve">„Upravit uživatele” (pole se zobrazí pouze pokud má uživatel</w:t>
+      </w:r>
+      <w:r>
+        <w:t xml:space="preserve"> </w:t>
+      </w:r>
+      <w:r>
+        <w:t xml:space="preserve">přiřazenu roli Žadatel): výchozí hodnota je „Pouze vlastní tikety”</w:t>
       </w:r>
     </w:p>
     <w:bookmarkStart w:id="9" w:name="tabulka-práv"/>
@@ -934,7 +1076,7 @@
               <w:jc w:val="center"/>
             </w:pPr>
             <w:r>
-              <w:t xml:space="preserve">jen vlastní</w:t>
+              <w:t xml:space="preserve">dle rozsahu ⁶</w:t>
             </w:r>
           </w:p>
         </w:tc>
@@ -1007,7 +1149,7 @@
               <w:jc w:val="center"/>
             </w:pPr>
             <w:r>
-              <w:t xml:space="preserve">jen vlastní</w:t>
+              <w:t xml:space="preserve">dle rozsahu ⁶</w:t>
             </w:r>
           </w:p>
         </w:tc>
@@ -1417,6 +1559,79 @@
               <w:pStyle w:val="Compact"/>
             </w:pPr>
             <w:r>
+              <w:t xml:space="preserve">Nastavit kategorii práce</w:t>
+            </w:r>
+          </w:p>
+        </w:tc>
+        <w:tc>
+          <w:tcPr/>
+          <w:p>
+            <w:pPr>
+              <w:pStyle w:val="Compact"/>
+              <w:jc w:val="center"/>
+            </w:pPr>
+            <w:r>
+              <w:t xml:space="preserve">—</w:t>
+            </w:r>
+          </w:p>
+        </w:tc>
+        <w:tc>
+          <w:tcPr/>
+          <w:p>
+            <w:pPr>
+              <w:pStyle w:val="Compact"/>
+              <w:jc w:val="center"/>
+            </w:pPr>
+            <w:r>
+              <w:t xml:space="preserve">přiřazený ²</w:t>
+            </w:r>
+          </w:p>
+        </w:tc>
+        <w:tc>
+          <w:tcPr/>
+          <w:p>
+            <w:pPr>
+              <w:pStyle w:val="Compact"/>
+              <w:jc w:val="center"/>
+            </w:pPr>
+            <w:r>
+              <w:t xml:space="preserve">—</w:t>
+            </w:r>
+          </w:p>
+        </w:tc>
+        <w:tc>
+          <w:tcPr/>
+          <w:p>
+            <w:pPr>
+              <w:pStyle w:val="Compact"/>
+              <w:jc w:val="center"/>
+            </w:pPr>
+            <w:r>
+              <w:t xml:space="preserve">✓ ¹ ²</w:t>
+            </w:r>
+          </w:p>
+        </w:tc>
+        <w:tc>
+          <w:tcPr/>
+          <w:p>
+            <w:pPr>
+              <w:pStyle w:val="Compact"/>
+              <w:jc w:val="center"/>
+            </w:pPr>
+            <w:r>
+              <w:t xml:space="preserve">—</w:t>
+            </w:r>
+          </w:p>
+        </w:tc>
+      </w:tr>
+      <w:tr>
+        <w:tc>
+          <w:tcPr/>
+          <w:p>
+            <w:pPr>
+              <w:pStyle w:val="Compact"/>
+            </w:pPr>
+            <w:r>
               <w:rPr>
                 <w:b/>
                 <w:bCs/>
@@ -1486,31 +1701,31 @@
               <w:jc w:val="center"/>
             </w:pPr>
             <w:r>
-              <w:t xml:space="preserve">jen vlastní</w:t>
-            </w:r>
-          </w:p>
-        </w:tc>
-        <w:tc>
-          <w:tcPr/>
-          <w:p>
-            <w:pPr>
-              <w:pStyle w:val="Compact"/>
-              <w:jc w:val="center"/>
-            </w:pPr>
-            <w:r>
-              <w:t xml:space="preserve">přiřazený</w:t>
-            </w:r>
-          </w:p>
-        </w:tc>
-        <w:tc>
-          <w:tcPr/>
-          <w:p>
-            <w:pPr>
-              <w:pStyle w:val="Compact"/>
-              <w:jc w:val="center"/>
-            </w:pPr>
-            <w:r>
-              <w:t xml:space="preserve">přiřazený</w:t>
+              <w:t xml:space="preserve">jen vlastní ⁵</w:t>
+            </w:r>
+          </w:p>
+        </w:tc>
+        <w:tc>
+          <w:tcPr/>
+          <w:p>
+            <w:pPr>
+              <w:pStyle w:val="Compact"/>
+              <w:jc w:val="center"/>
+            </w:pPr>
+            <w:r>
+              <w:t xml:space="preserve">přiřazený (jen otevřený)</w:t>
+            </w:r>
+          </w:p>
+        </w:tc>
+        <w:tc>
+          <w:tcPr/>
+          <w:p>
+            <w:pPr>
+              <w:pStyle w:val="Compact"/>
+              <w:jc w:val="center"/>
+            </w:pPr>
+            <w:r>
+              <w:t xml:space="preserve">přiřazený (jen otevřený)</w:t>
             </w:r>
           </w:p>
         </w:tc>
@@ -1847,7 +2062,7 @@
               <w:jc w:val="center"/>
             </w:pPr>
             <w:r>
-              <w:t xml:space="preserve">Nový ⁴</w:t>
+              <w:t xml:space="preserve">Nový, Řeší se ⁴</w:t>
             </w:r>
           </w:p>
         </w:tc>
@@ -2878,6 +3093,152 @@
           </w:p>
         </w:tc>
       </w:tr>
+      <w:tr>
+        <w:tc>
+          <w:tcPr/>
+          <w:p>
+            <w:pPr>
+              <w:pStyle w:val="Compact"/>
+            </w:pPr>
+            <w:r>
+              <w:t xml:space="preserve">Nastavit rozsah viditelnosti žadatelům</w:t>
+            </w:r>
+          </w:p>
+        </w:tc>
+        <w:tc>
+          <w:tcPr/>
+          <w:p>
+            <w:pPr>
+              <w:pStyle w:val="Compact"/>
+              <w:jc w:val="center"/>
+            </w:pPr>
+            <w:r>
+              <w:t xml:space="preserve">—</w:t>
+            </w:r>
+          </w:p>
+        </w:tc>
+        <w:tc>
+          <w:tcPr/>
+          <w:p>
+            <w:pPr>
+              <w:pStyle w:val="Compact"/>
+              <w:jc w:val="center"/>
+            </w:pPr>
+            <w:r>
+              <w:t xml:space="preserve">—</w:t>
+            </w:r>
+          </w:p>
+        </w:tc>
+        <w:tc>
+          <w:tcPr/>
+          <w:p>
+            <w:pPr>
+              <w:pStyle w:val="Compact"/>
+              <w:jc w:val="center"/>
+            </w:pPr>
+            <w:r>
+              <w:t xml:space="preserve">—</w:t>
+            </w:r>
+          </w:p>
+        </w:tc>
+        <w:tc>
+          <w:tcPr/>
+          <w:p>
+            <w:pPr>
+              <w:pStyle w:val="Compact"/>
+              <w:jc w:val="center"/>
+            </w:pPr>
+            <w:r>
+              <w:t xml:space="preserve">—</w:t>
+            </w:r>
+          </w:p>
+        </w:tc>
+        <w:tc>
+          <w:tcPr/>
+          <w:p>
+            <w:pPr>
+              <w:pStyle w:val="Compact"/>
+              <w:jc w:val="center"/>
+            </w:pPr>
+            <w:r>
+              <w:t xml:space="preserve">✓</w:t>
+            </w:r>
+          </w:p>
+        </w:tc>
+      </w:tr>
+      <w:tr>
+        <w:tc>
+          <w:tcPr/>
+          <w:p>
+            <w:pPr>
+              <w:pStyle w:val="Compact"/>
+            </w:pPr>
+            <w:r>
+              <w:t xml:space="preserve">Spravovat kategorie práce</w:t>
+            </w:r>
+          </w:p>
+        </w:tc>
+        <w:tc>
+          <w:tcPr/>
+          <w:p>
+            <w:pPr>
+              <w:pStyle w:val="Compact"/>
+              <w:jc w:val="center"/>
+            </w:pPr>
+            <w:r>
+              <w:t xml:space="preserve">—</w:t>
+            </w:r>
+          </w:p>
+        </w:tc>
+        <w:tc>
+          <w:tcPr/>
+          <w:p>
+            <w:pPr>
+              <w:pStyle w:val="Compact"/>
+              <w:jc w:val="center"/>
+            </w:pPr>
+            <w:r>
+              <w:t xml:space="preserve">—</w:t>
+            </w:r>
+          </w:p>
+        </w:tc>
+        <w:tc>
+          <w:tcPr/>
+          <w:p>
+            <w:pPr>
+              <w:pStyle w:val="Compact"/>
+              <w:jc w:val="center"/>
+            </w:pPr>
+            <w:r>
+              <w:t xml:space="preserve">—</w:t>
+            </w:r>
+          </w:p>
+        </w:tc>
+        <w:tc>
+          <w:tcPr/>
+          <w:p>
+            <w:pPr>
+              <w:pStyle w:val="Compact"/>
+              <w:jc w:val="center"/>
+            </w:pPr>
+            <w:r>
+              <w:t xml:space="preserve">—</w:t>
+            </w:r>
+          </w:p>
+        </w:tc>
+        <w:tc>
+          <w:tcPr/>
+          <w:p>
+            <w:pPr>
+              <w:pStyle w:val="Compact"/>
+              <w:jc w:val="center"/>
+            </w:pPr>
+            <w:r>
+              <w:t xml:space="preserve">✓</w:t>
+            </w:r>
+          </w:p>
+        </w:tc>
+      </w:tr>
     </w:tbl>
     <w:p>
       <w:pPr>
@@ -2908,12 +3269,28 @@
         <w:pStyle w:val="BodyText"/>
       </w:pPr>
       <w:r>
-        <w:t xml:space="preserve">⁴ Řešitel vidí (a může převzít) nové tikety v rámci svých oblastí (nebo všechny, pokud nemá omezení), ale komentovat je může až po přiřazení. Přiřazené tikety vidí vždy bez ohledu na oblast.</w:t>
+        <w:t xml:space="preserve">⁴ Řešitel vidí (a může převzít) nové tikety v rámci svých oblastí (nebo všechny, pokud nemá omezení), ale komentovat je může až po přiřazení. Přiřazené tikety vidí vždy bez ohledu na oblast. Převzít lze i tiket ve stavu „Řeší se” — v takovém případě se změní pouze přiřazený řešitel, stav zůstane.</w:t>
+      </w:r>
+    </w:p>
+    <w:p>
+      <w:pPr>
+        <w:pStyle w:val="BodyText"/>
+      </w:pPr>
+      <w:r>
+        <w:t xml:space="preserve">⁵ Žadatel může komentovat vlastní tiket i ve stavu „Vyřešeno” nebo „Zamítnuto” (může nesouhlasit s uzavřením). Řešitel a obchodník komentovat uzavřený tiket nemohou. Správce uzavřený tiket komentovat může (může reagovat nebo tiket znovu otevřít).</w:t>
+      </w:r>
+    </w:p>
+    <w:p>
+      <w:pPr>
+        <w:pStyle w:val="BodyText"/>
+      </w:pPr>
+      <w:r>
+        <w:t xml:space="preserve">⁶ Rozsah viditelnosti žadatele nastavuje administrátor per-uživatel: (a) pouze vlastní tikety, (b) všechny tikety firmy, (c) tikety firmy v konkrétních oblastech (vlastní tikety jsou vždy viditelné). Právo komentovat má žadatel vždy jen u tiketů, které sám založil.</w:t>
       </w:r>
     </w:p>
     <w:bookmarkEnd w:id="9"/>
     <w:bookmarkEnd w:id="10"/>
-    <w:bookmarkStart w:id="15" w:name="požadavky"/>
+    <w:bookmarkStart w:id="19" w:name="požadavky"/>
     <w:p>
       <w:pPr>
         <w:pStyle w:val="Heading2"/>
@@ -2928,75 +3305,6 @@
       </w:pPr>
       <w:r>
         <w:t xml:space="preserve">Požadavky zakládá žadatel a musí vyplnit</w:t>
-      </w:r>
-    </w:p>
-    <w:p>
-      <w:pPr>
-        <w:numPr>
-          <w:ilvl w:val="0"/>
-          <w:numId w:val="1008"/>
-        </w:numPr>
-      </w:pPr>
-      <w:r>
-        <w:t xml:space="preserve">Typ požadavku</w:t>
-      </w:r>
-    </w:p>
-    <w:p>
-      <w:pPr>
-        <w:numPr>
-          <w:ilvl w:val="0"/>
-          <w:numId w:val="1008"/>
-        </w:numPr>
-      </w:pPr>
-      <w:r>
-        <w:t xml:space="preserve">Název</w:t>
-      </w:r>
-    </w:p>
-    <w:p>
-      <w:pPr>
-        <w:numPr>
-          <w:ilvl w:val="0"/>
-          <w:numId w:val="1008"/>
-        </w:numPr>
-      </w:pPr>
-      <w:r>
-        <w:t xml:space="preserve">Popis</w:t>
-      </w:r>
-    </w:p>
-    <w:p>
-      <w:pPr>
-        <w:numPr>
-          <w:ilvl w:val="0"/>
-          <w:numId w:val="1008"/>
-        </w:numPr>
-      </w:pPr>
-      <w:r>
-        <w:t xml:space="preserve">Oblast (výběr z administrátorem definovaných oblastí)</w:t>
-      </w:r>
-    </w:p>
-    <w:p>
-      <w:pPr>
-        <w:numPr>
-          <w:ilvl w:val="0"/>
-          <w:numId w:val="1008"/>
-        </w:numPr>
-      </w:pPr>
-      <w:r>
-        <w:t xml:space="preserve">Prioritu (Vysoká, Střední, Nízká)</w:t>
-      </w:r>
-    </w:p>
-    <w:p>
-      <w:pPr>
-        <w:pStyle w:val="FirstParagraph"/>
-      </w:pPr>
-      <w:r>
-        <w:t xml:space="preserve">Požadavek může žadatel založit i odesláním na předdefinovanou e-mailovou</w:t>
-      </w:r>
-      <w:r>
-        <w:t xml:space="preserve"> </w:t>
-      </w:r>
-      <w:r>
-        <w:t xml:space="preserve">adresu. V takovém případě se požadavek založí následovně:</w:t>
       </w:r>
     </w:p>
     <w:p>
@@ -3007,7 +3315,7 @@
         </w:numPr>
       </w:pPr>
       <w:r>
-        <w:t xml:space="preserve">Typ požadavku = Hlášení problému</w:t>
+        <w:t xml:space="preserve">Typ požadavku</w:t>
       </w:r>
     </w:p>
     <w:p>
@@ -3018,7 +3326,7 @@
         </w:numPr>
       </w:pPr>
       <w:r>
-        <w:t xml:space="preserve">Název = Předmět e-mailu</w:t>
+        <w:t xml:space="preserve">Název</w:t>
       </w:r>
     </w:p>
     <w:p>
@@ -3029,7 +3337,7 @@
         </w:numPr>
       </w:pPr>
       <w:r>
-        <w:t xml:space="preserve">Popis = Tělo e-mailu (plain text)</w:t>
+        <w:t xml:space="preserve">Popis</w:t>
       </w:r>
     </w:p>
     <w:p>
@@ -3040,7 +3348,7 @@
         </w:numPr>
       </w:pPr>
       <w:r>
-        <w:t xml:space="preserve">Oblast = oblast označená jako neznámá (pokud existuje)</w:t>
+        <w:t xml:space="preserve">Oblast (výběr z administrátorem definovaných oblastí)</w:t>
       </w:r>
     </w:p>
     <w:p>
@@ -3051,30 +3359,7 @@
         </w:numPr>
       </w:pPr>
       <w:r>
-        <w:t xml:space="preserve">Priorita = Střední</w:t>
-      </w:r>
-    </w:p>
-    <w:p>
-      <w:pPr>
-        <w:numPr>
-          <w:ilvl w:val="0"/>
-          <w:numId w:val="1009"/>
-        </w:numPr>
-      </w:pPr>
-      <w:r>
-        <w:t xml:space="preserve">Přílohy = soubory přiložené k e-mailu jsou uloženy jako přílohy tiketu</w:t>
-      </w:r>
-      <w:r>
-        <w:t xml:space="preserve"> </w:t>
-      </w:r>
-      <w:r>
-        <w:t xml:space="preserve">(stejná pravidla jako při ručním nahrání: povolené typy, max 5 MB;</w:t>
-      </w:r>
-      <w:r>
-        <w:t xml:space="preserve"> </w:t>
-      </w:r>
-      <w:r>
-        <w:t xml:space="preserve">soubory s nepovolenou příponou nebo překračující limit jsou přeskočeny)</w:t>
+        <w:t xml:space="preserve">Prioritu (Vysoká, Střední, Nízká)</w:t>
       </w:r>
     </w:p>
     <w:p>
@@ -3082,21 +3367,13 @@
         <w:pStyle w:val="FirstParagraph"/>
       </w:pPr>
       <w:r>
-        <w:t xml:space="preserve">E-mail zpracuje pouze systém, pokud odesílatel odpovídá aktivnímu</w:t>
-      </w:r>
-      <w:r>
-        <w:t xml:space="preserve"> </w:t>
-      </w:r>
-      <w:r>
-        <w:t xml:space="preserve">uživateli s rolí Žadatel. Neznámí odesílatelé jsou ignorováni.</w:t>
-      </w:r>
-    </w:p>
-    <w:p>
-      <w:pPr>
-        <w:pStyle w:val="BodyText"/>
-      </w:pPr>
-      <w:r>
-        <w:t xml:space="preserve">Ochrana proti zneužití:</w:t>
+        <w:t xml:space="preserve">Požadavek může žadatel založit i odesláním na předdefinovanou e-mailovou</w:t>
+      </w:r>
+      <w:r>
+        <w:t xml:space="preserve"> </w:t>
+      </w:r>
+      <w:r>
+        <w:t xml:space="preserve">adresu. V takovém případě se požadavek založí následovně:</w:t>
       </w:r>
     </w:p>
     <w:p>
@@ -3107,13 +3384,7 @@
         </w:numPr>
       </w:pPr>
       <w:r>
-        <w:t xml:space="preserve">Deduplikace — každý e-mail je identifikován hlavičkou Message-ID;</w:t>
-      </w:r>
-      <w:r>
-        <w:t xml:space="preserve"> </w:t>
-      </w:r>
-      <w:r>
-        <w:t xml:space="preserve">e-mail se stejným Message-ID je zpracován pouze jednou (TTL 30 dní).</w:t>
+        <w:t xml:space="preserve">Typ požadavku = Hlášení problému</w:t>
       </w:r>
     </w:p>
     <w:p>
@@ -3124,13 +3395,63 @@
         </w:numPr>
       </w:pPr>
       <w:r>
-        <w:t xml:space="preserve">Rate limiting — jeden žadatel může prostřednictvím e-mailu vytvořit</w:t>
-      </w:r>
-      <w:r>
-        <w:t xml:space="preserve"> </w:t>
-      </w:r>
-      <w:r>
-        <w:t xml:space="preserve">nejvýše 10 tiketů za hodinu; další e-maily jsou v daném okně ignorovány.</w:t>
+        <w:t xml:space="preserve">Název = Předmět e-mailu</w:t>
+      </w:r>
+    </w:p>
+    <w:p>
+      <w:pPr>
+        <w:numPr>
+          <w:ilvl w:val="0"/>
+          <w:numId w:val="1010"/>
+        </w:numPr>
+      </w:pPr>
+      <w:r>
+        <w:t xml:space="preserve">Popis = Tělo e-mailu (plain text)</w:t>
+      </w:r>
+    </w:p>
+    <w:p>
+      <w:pPr>
+        <w:numPr>
+          <w:ilvl w:val="0"/>
+          <w:numId w:val="1010"/>
+        </w:numPr>
+      </w:pPr>
+      <w:r>
+        <w:t xml:space="preserve">Oblast = oblast označená jako neznámá (pokud existuje)</w:t>
+      </w:r>
+    </w:p>
+    <w:p>
+      <w:pPr>
+        <w:numPr>
+          <w:ilvl w:val="0"/>
+          <w:numId w:val="1010"/>
+        </w:numPr>
+      </w:pPr>
+      <w:r>
+        <w:t xml:space="preserve">Priorita = Střední</w:t>
+      </w:r>
+    </w:p>
+    <w:p>
+      <w:pPr>
+        <w:numPr>
+          <w:ilvl w:val="0"/>
+          <w:numId w:val="1010"/>
+        </w:numPr>
+      </w:pPr>
+      <w:r>
+        <w:t xml:space="preserve">Přílohy = soubory přiložené k e-mailu jsou uloženy jako přílohy tiketu</w:t>
+      </w:r>
+      <w:r>
+        <w:t xml:space="preserve"> </w:t>
+      </w:r>
+      <w:r>
+        <w:t xml:space="preserve">(stejná pravidla jako při ručním nahrání: povolené typy, max 5 MB;</w:t>
+      </w:r>
+      <w:r>
+        <w:t xml:space="preserve"> </w:t>
+      </w:r>
+      <w:r>
+        <w:t xml:space="preserve">soubory s nepovolenou příponou nebo překračující limit jsou přeskočeny)</w:t>
       </w:r>
     </w:p>
     <w:p>
@@ -3138,7 +3459,21 @@
         <w:pStyle w:val="FirstParagraph"/>
       </w:pPr>
       <w:r>
-        <w:t xml:space="preserve">Požadavky mohu být typu</w:t>
+        <w:t xml:space="preserve">E-mail zpracuje pouze systém, pokud odesílatel odpovídá aktivnímu</w:t>
+      </w:r>
+      <w:r>
+        <w:t xml:space="preserve"> </w:t>
+      </w:r>
+      <w:r>
+        <w:t xml:space="preserve">uživateli s rolí Žadatel. Neznámí odesílatelé jsou ignorováni.</w:t>
+      </w:r>
+    </w:p>
+    <w:p>
+      <w:pPr>
+        <w:pStyle w:val="BodyText"/>
+      </w:pPr>
+      <w:r>
+        <w:t xml:space="preserve">Ochrana proti zneužití:</w:t>
       </w:r>
     </w:p>
     <w:p>
@@ -3149,102 +3484,13 @@
         </w:numPr>
       </w:pPr>
       <w:r>
-        <w:t xml:space="preserve">Hlášení problému</w:t>
-      </w:r>
-    </w:p>
-    <w:p>
-      <w:pPr>
-        <w:numPr>
-          <w:ilvl w:val="1"/>
-          <w:numId w:val="1012"/>
-        </w:numPr>
-      </w:pPr>
-      <w:r>
-        <w:t xml:space="preserve">Hotline problém, nefakturuje se</w:t>
-      </w:r>
-    </w:p>
-    <w:p>
-      <w:pPr>
-        <w:numPr>
-          <w:ilvl w:val="1"/>
-          <w:numId w:val="1012"/>
-        </w:numPr>
-      </w:pPr>
-      <w:r>
-        <w:t xml:space="preserve">Stavy</w:t>
-      </w:r>
-    </w:p>
-    <w:p>
-      <w:pPr>
-        <w:pStyle w:val="Compact"/>
-        <w:numPr>
-          <w:ilvl w:val="2"/>
-          <w:numId w:val="1013"/>
-        </w:numPr>
-      </w:pPr>
-      <w:r>
-        <w:t xml:space="preserve">Nový, Řeší se, Vyřešeno, Zamítnuto</w:t>
-      </w:r>
-    </w:p>
-    <w:p>
-      <w:pPr>
-        <w:numPr>
-          <w:ilvl w:val="1"/>
-          <w:numId w:val="1012"/>
-        </w:numPr>
-      </w:pPr>
-      <w:r>
-        <w:t xml:space="preserve">Přechody mezi stavy</w:t>
-      </w:r>
-    </w:p>
-    <w:p>
-      <w:pPr>
-        <w:numPr>
-          <w:ilvl w:val="2"/>
-          <w:numId w:val="1014"/>
-        </w:numPr>
-      </w:pPr>
-      <w:r>
-        <w:t xml:space="preserve">Založení požadavku: Nový</w:t>
-      </w:r>
-    </w:p>
-    <w:p>
-      <w:pPr>
-        <w:numPr>
-          <w:ilvl w:val="2"/>
-          <w:numId w:val="1014"/>
-        </w:numPr>
-      </w:pPr>
-      <w:r>
-        <w:t xml:space="preserve">Přiřazení řešitele: Nový -&gt; Řeší se</w:t>
-      </w:r>
-    </w:p>
-    <w:p>
-      <w:pPr>
-        <w:numPr>
-          <w:ilvl w:val="2"/>
-          <w:numId w:val="1014"/>
-        </w:numPr>
-      </w:pPr>
-      <w:r>
-        <w:t xml:space="preserve">Vyřešení: Řeší se -&gt; Vyřešeno (musí se zadat způsob vyřešení a</w:t>
-      </w:r>
-      <w:r>
-        <w:t xml:space="preserve"> </w:t>
-      </w:r>
-      <w:r>
-        <w:t xml:space="preserve">spotřebovaný čas)</w:t>
-      </w:r>
-    </w:p>
-    <w:p>
-      <w:pPr>
-        <w:numPr>
-          <w:ilvl w:val="2"/>
-          <w:numId w:val="1014"/>
-        </w:numPr>
-      </w:pPr>
-      <w:r>
-        <w:t xml:space="preserve">Zamítnutí: jakýkoliv stav -&gt; Zamítnuto</w:t>
+        <w:t xml:space="preserve">Deduplikace — každý e-mail je identifikován hlavičkou Message-ID;</w:t>
+      </w:r>
+      <w:r>
+        <w:t xml:space="preserve"> </w:t>
+      </w:r>
+      <w:r>
+        <w:t xml:space="preserve">e-mail se stejným Message-ID je zpracován pouze jednou (TTL 30 dní).</w:t>
       </w:r>
     </w:p>
     <w:p>
@@ -3255,51 +3501,599 @@
         </w:numPr>
       </w:pPr>
       <w:r>
-        <w:t xml:space="preserve">Požadavek na vývoj</w:t>
+        <w:t xml:space="preserve">Rate limiting — jeden žadatel může prostřednictvím e-mailu vytvořit</w:t>
+      </w:r>
+      <w:r>
+        <w:t xml:space="preserve"> </w:t>
+      </w:r>
+      <w:r>
+        <w:t xml:space="preserve">nejvýše 10 tiketů za hodinu; další e-maily jsou v daném okně ignorovány.</w:t>
+      </w:r>
+    </w:p>
+    <w:bookmarkStart w:id="11" w:name="automatické-zamítací-odpovědi"/>
+    <w:p>
+      <w:pPr>
+        <w:pStyle w:val="Heading3"/>
+      </w:pPr>
+      <w:r>
+        <w:t xml:space="preserve">Automatické zamítací odpovědi</w:t>
+      </w:r>
+    </w:p>
+    <w:p>
+      <w:pPr>
+        <w:pStyle w:val="FirstParagraph"/>
+      </w:pPr>
+      <w:r>
+        <w:t xml:space="preserve">Pokud systém e-mail zamítne a odesílatel je rozpoznán jako registrovaný</w:t>
+      </w:r>
+      <w:r>
+        <w:t xml:space="preserve"> </w:t>
+      </w:r>
+      <w:r>
+        <w:t xml:space="preserve">uživatel, odešle mu systém automatickou odpověď s důvodem zamítnutí.</w:t>
+      </w:r>
+      <w:r>
+        <w:t xml:space="preserve"> </w:t>
+      </w:r>
+      <w:r>
+        <w:t xml:space="preserve">Neznámým odesílatelům se odpověď neposílá (ochrana před backscatter</w:t>
+      </w:r>
+      <w:r>
+        <w:t xml:space="preserve"> </w:t>
+      </w:r>
+      <w:r>
+        <w:t xml:space="preserve">spamem).</w:t>
+      </w:r>
+    </w:p>
+    <w:tbl>
+      <w:tblPr>
+        <w:tblStyle w:val="Table"/>
+        <w:tblW w:type="pct" w:w="5000"/>
+        <w:tblLayout w:type="fixed"/>
+        <w:tblLook w:firstRow="1" w:lastRow="0" w:firstColumn="0" w:lastColumn="0" w:noHBand="0" w:noVBand="0" w:val="0020"/>
+      </w:tblPr>
+      <w:tblGrid>
+        <w:gridCol w:w="3960"/>
+        <w:gridCol w:w="3960"/>
+      </w:tblGrid>
+      <w:tr>
+        <w:trPr>
+          <w:tblHeader w:val="on"/>
+        </w:trPr>
+        <w:tc>
+          <w:tcPr/>
+          <w:p>
+            <w:pPr>
+              <w:pStyle w:val="Compact"/>
+            </w:pPr>
+            <w:r>
+              <w:t xml:space="preserve">Důvod zamítnutí</w:t>
+            </w:r>
+          </w:p>
+        </w:tc>
+        <w:tc>
+          <w:tcPr/>
+          <w:p>
+            <w:pPr>
+              <w:pStyle w:val="Compact"/>
+            </w:pPr>
+            <w:r>
+              <w:t xml:space="preserve">Komu se odpověď posílá</w:t>
+            </w:r>
+          </w:p>
+        </w:tc>
+      </w:tr>
+      <w:tr>
+        <w:tc>
+          <w:tcPr/>
+          <w:p>
+            <w:pPr>
+              <w:pStyle w:val="Compact"/>
+            </w:pPr>
+            <w:r>
+              <w:t xml:space="preserve">Uživatel nemá roli Žadatel (zakládání tiketu)</w:t>
+            </w:r>
+          </w:p>
+        </w:tc>
+        <w:tc>
+          <w:tcPr/>
+          <w:p>
+            <w:pPr>
+              <w:pStyle w:val="Compact"/>
+            </w:pPr>
+            <w:r>
+              <w:t xml:space="preserve">Registrovaný uživatel s jinou rolí</w:t>
+            </w:r>
+          </w:p>
+        </w:tc>
+      </w:tr>
+      <w:tr>
+        <w:tc>
+          <w:tcPr/>
+          <w:p>
+            <w:pPr>
+              <w:pStyle w:val="Compact"/>
+            </w:pPr>
+            <w:r>
+              <w:t xml:space="preserve">Překročen rate limit</w:t>
+            </w:r>
+          </w:p>
+        </w:tc>
+        <w:tc>
+          <w:tcPr/>
+          <w:p>
+            <w:pPr>
+              <w:pStyle w:val="Compact"/>
+            </w:pPr>
+            <w:r>
+              <w:t xml:space="preserve">Registrovaný uživatel — pouze první zamítnutí v hodinovém okně; další jsou ignorována, aby nedošlo k zahlcení e-maily</w:t>
+            </w:r>
+          </w:p>
+        </w:tc>
+      </w:tr>
+      <w:tr>
+        <w:tc>
+          <w:tcPr/>
+          <w:p>
+            <w:pPr>
+              <w:pStyle w:val="Compact"/>
+            </w:pPr>
+            <w:r>
+              <w:t xml:space="preserve">Tiket z tokenu neexistuje (odpověď)</w:t>
+            </w:r>
+          </w:p>
+        </w:tc>
+        <w:tc>
+          <w:tcPr/>
+          <w:p>
+            <w:pPr>
+              <w:pStyle w:val="Compact"/>
+            </w:pPr>
+            <w:r>
+              <w:t xml:space="preserve">Odesílatel odpovědi</w:t>
+            </w:r>
+          </w:p>
+        </w:tc>
+      </w:tr>
+      <w:tr>
+        <w:tc>
+          <w:tcPr/>
+          <w:p>
+            <w:pPr>
+              <w:pStyle w:val="Compact"/>
+            </w:pPr>
+            <w:r>
+              <w:t xml:space="preserve">Nedostatečná oprávnění ke komentáři (odpověď)</w:t>
+            </w:r>
+          </w:p>
+        </w:tc>
+        <w:tc>
+          <w:tcPr/>
+          <w:p>
+            <w:pPr>
+              <w:pStyle w:val="Compact"/>
+            </w:pPr>
+            <w:r>
+              <w:t xml:space="preserve">Odesílatel odpovědi</w:t>
+            </w:r>
+          </w:p>
+        </w:tc>
+      </w:tr>
+      <w:tr>
+        <w:tc>
+          <w:tcPr/>
+          <w:p>
+            <w:pPr>
+              <w:pStyle w:val="Compact"/>
+            </w:pPr>
+            <w:r>
+              <w:t xml:space="preserve">Prázdné tělo zprávy po odebrání citace (odpověď)</w:t>
+            </w:r>
+          </w:p>
+        </w:tc>
+        <w:tc>
+          <w:tcPr/>
+          <w:p>
+            <w:pPr>
+              <w:pStyle w:val="Compact"/>
+            </w:pPr>
+            <w:r>
+              <w:t xml:space="preserve">Odesílatel odpovědi</w:t>
+            </w:r>
+          </w:p>
+        </w:tc>
+      </w:tr>
+      <w:tr>
+        <w:tc>
+          <w:tcPr/>
+          <w:p>
+            <w:pPr>
+              <w:pStyle w:val="Compact"/>
+            </w:pPr>
+            <w:r>
+              <w:t xml:space="preserve">Nekonzistentní token — jiné ID v předmětu a těle</w:t>
+            </w:r>
+          </w:p>
+        </w:tc>
+        <w:tc>
+          <w:tcPr/>
+          <w:p>
+            <w:pPr>
+              <w:pStyle w:val="Compact"/>
+            </w:pPr>
+            <w:r>
+              <w:t xml:space="preserve">Registrovaný uživatel</w:t>
+            </w:r>
+          </w:p>
+        </w:tc>
+      </w:tr>
+      <w:tr>
+        <w:tc>
+          <w:tcPr/>
+          <w:p>
+            <w:pPr>
+              <w:pStyle w:val="Compact"/>
+            </w:pPr>
+            <w:r>
+              <w:t xml:space="preserve">Neznámý odesílatel</w:t>
+            </w:r>
+          </w:p>
+        </w:tc>
+        <w:tc>
+          <w:tcPr/>
+          <w:p>
+            <w:pPr>
+              <w:pStyle w:val="Compact"/>
+            </w:pPr>
+            <w:r>
+              <w:t xml:space="preserve">— (tiché ignorování)</w:t>
+            </w:r>
+          </w:p>
+        </w:tc>
+      </w:tr>
+    </w:tbl>
+    <w:bookmarkEnd w:id="11"/>
+    <w:bookmarkStart w:id="12" w:name="Xac1484fca02b50fe00a7b9eebe03fef337523a5"/>
+    <w:p>
+      <w:pPr>
+        <w:pStyle w:val="Heading3"/>
+      </w:pPr>
+      <w:r>
+        <w:t xml:space="preserve">Odpověď na notifikaci → komentář (reply-to-ticket)</w:t>
+      </w:r>
+    </w:p>
+    <w:p>
+      <w:pPr>
+        <w:pStyle w:val="FirstParagraph"/>
+      </w:pPr>
+      <w:r>
+        <w:t xml:space="preserve">Každý odchozí notifikační e-mail obsahuje v předmětu i těle token ve</w:t>
+      </w:r>
+      <w:r>
+        <w:t xml:space="preserve"> </w:t>
+      </w:r>
+      <w:r>
+        <w:t xml:space="preserve">tvaru</w:t>
+      </w:r>
+      <w:r>
+        <w:t xml:space="preserve"> </w:t>
+      </w:r>
+      <w:r>
+        <w:rPr>
+          <w:rStyle w:val="VerbatimChar"/>
+        </w:rPr>
+        <w:t xml:space="preserve">[#42#]</w:t>
+      </w:r>
+      <w:r>
+        <w:t xml:space="preserve"> </w:t>
+      </w:r>
+      <w:r>
+        <w:t xml:space="preserve">(číslo tiketu). Odesílatel může na notifikaci odpovědět</w:t>
+      </w:r>
+      <w:r>
+        <w:t xml:space="preserve"> </w:t>
+      </w:r>
+      <w:r>
+        <w:t xml:space="preserve">a systém odpověď automaticky přidá jako komentář k danému tiketu.</w:t>
+      </w:r>
+    </w:p>
+    <w:p>
+      <w:pPr>
+        <w:pStyle w:val="BodyText"/>
+      </w:pPr>
+      <w:r>
+        <w:t xml:space="preserve">Pravidla zpracování příchozí odpovědi:</w:t>
+      </w:r>
+    </w:p>
+    <w:p>
+      <w:pPr>
+        <w:numPr>
+          <w:ilvl w:val="0"/>
+          <w:numId w:val="1012"/>
+        </w:numPr>
+      </w:pPr>
+      <w:r>
+        <w:t xml:space="preserve">Token</w:t>
+      </w:r>
+      <w:r>
+        <w:t xml:space="preserve"> </w:t>
+      </w:r>
+      <w:r>
+        <w:rPr>
+          <w:rStyle w:val="VerbatimChar"/>
+        </w:rPr>
+        <w:t xml:space="preserve">[#42#]</w:t>
+      </w:r>
+      <w:r>
+        <w:t xml:space="preserve"> </w:t>
+      </w:r>
+      <w:r>
+        <w:t xml:space="preserve">je hledán v předmětu i těle e-mailu (plain text).</w:t>
+      </w:r>
+      <w:r>
+        <w:t xml:space="preserve"> </w:t>
+      </w:r>
+      <w:r>
+        <w:t xml:space="preserve">Pokud je přítomen v obou a čísla se liší, e-mail je ignorován.</w:t>
+      </w:r>
+    </w:p>
+    <w:p>
+      <w:pPr>
+        <w:numPr>
+          <w:ilvl w:val="0"/>
+          <w:numId w:val="1012"/>
+        </w:numPr>
+      </w:pPr>
+      <w:r>
+        <w:t xml:space="preserve">Odesílatel musí být libovolný aktivní uživatel systému (nejen Žadatel).</w:t>
+      </w:r>
+    </w:p>
+    <w:p>
+      <w:pPr>
+        <w:numPr>
+          <w:ilvl w:val="0"/>
+          <w:numId w:val="1012"/>
+        </w:numPr>
+      </w:pPr>
+      <w:r>
+        <w:t xml:space="preserve">Platí stejná oprávnění jako při komentování na webu — viz sekci</w:t>
+      </w:r>
+      <w:r>
+        <w:t xml:space="preserve"> </w:t>
+      </w:r>
+      <w:r>
+        <w:t xml:space="preserve">Komentáře níže.</w:t>
+      </w:r>
+    </w:p>
+    <w:p>
+      <w:pPr>
+        <w:numPr>
+          <w:ilvl w:val="0"/>
+          <w:numId w:val="1012"/>
+        </w:numPr>
+      </w:pPr>
+      <w:r>
+        <w:t xml:space="preserve">Z těla odpovědi je automaticky odstraněn citovaný text (quoted reply),</w:t>
+      </w:r>
+      <w:r>
+        <w:t xml:space="preserve"> </w:t>
+      </w:r>
+      <w:r>
+        <w:t xml:space="preserve">komentář obsahuje pouze nový obsah.</w:t>
+      </w:r>
+    </w:p>
+    <w:p>
+      <w:pPr>
+        <w:numPr>
+          <w:ilvl w:val="0"/>
+          <w:numId w:val="1012"/>
+        </w:numPr>
+      </w:pPr>
+      <w:r>
+        <w:t xml:space="preserve">Přílohy jsou uloženy jako přílohy tiketu (stejná pravidla jako jiné</w:t>
+      </w:r>
+      <w:r>
+        <w:t xml:space="preserve"> </w:t>
+      </w:r>
+      <w:r>
+        <w:t xml:space="preserve">přílohy z e-mailu).</w:t>
+      </w:r>
+    </w:p>
+    <w:p>
+      <w:pPr>
+        <w:numPr>
+          <w:ilvl w:val="0"/>
+          <w:numId w:val="1012"/>
+        </w:numPr>
+      </w:pPr>
+      <w:r>
+        <w:t xml:space="preserve">Rate limiting je sdílený s vytváříním tiketů (10 e-mailových akcí/hod</w:t>
+      </w:r>
+      <w:r>
+        <w:t xml:space="preserve"> </w:t>
+      </w:r>
+      <w:r>
+        <w:t xml:space="preserve">na odesílatele).</w:t>
+      </w:r>
+    </w:p>
+    <w:p>
+      <w:pPr>
+        <w:numPr>
+          <w:ilvl w:val="0"/>
+          <w:numId w:val="1012"/>
+        </w:numPr>
+      </w:pPr>
+      <w:r>
+        <w:t xml:space="preserve">Po přidání komentáře se odešle standardní notifikace o novém komentáři.</w:t>
+      </w:r>
+    </w:p>
+    <w:p>
+      <w:pPr>
+        <w:pStyle w:val="FirstParagraph"/>
+      </w:pPr>
+      <w:r>
+        <w:t xml:space="preserve">Požadavky mohu být typu</w:t>
+      </w:r>
+    </w:p>
+    <w:p>
+      <w:pPr>
+        <w:numPr>
+          <w:ilvl w:val="0"/>
+          <w:numId w:val="1013"/>
+        </w:numPr>
+      </w:pPr>
+      <w:r>
+        <w:t xml:space="preserve">Hlášení problému</w:t>
       </w:r>
     </w:p>
     <w:p>
       <w:pPr>
         <w:numPr>
           <w:ilvl w:val="1"/>
+          <w:numId w:val="1014"/>
+        </w:numPr>
+      </w:pPr>
+      <w:r>
+        <w:t xml:space="preserve">Hotline problém, nefakturuje se</w:t>
+      </w:r>
+    </w:p>
+    <w:p>
+      <w:pPr>
+        <w:numPr>
+          <w:ilvl w:val="1"/>
+          <w:numId w:val="1014"/>
+        </w:numPr>
+      </w:pPr>
+      <w:r>
+        <w:t xml:space="preserve">Stavy</w:t>
+      </w:r>
+    </w:p>
+    <w:p>
+      <w:pPr>
+        <w:pStyle w:val="Compact"/>
+        <w:numPr>
+          <w:ilvl w:val="2"/>
           <w:numId w:val="1015"/>
         </w:numPr>
       </w:pPr>
       <w:r>
-        <w:t xml:space="preserve">Fakturovaný požadavek</w:t>
+        <w:t xml:space="preserve">Nový, Řeší se, Vyřešeno, Zamítnuto</w:t>
       </w:r>
     </w:p>
     <w:p>
       <w:pPr>
         <w:numPr>
           <w:ilvl w:val="1"/>
-          <w:numId w:val="1015"/>
-        </w:numPr>
-      </w:pPr>
-      <w:r>
-        <w:t xml:space="preserve">Může k němu být přiřazen Obchodník, pokud je potřeba</w:t>
-      </w:r>
-    </w:p>
-    <w:p>
-      <w:pPr>
-        <w:numPr>
-          <w:ilvl w:val="1"/>
-          <w:numId w:val="1015"/>
-        </w:numPr>
-      </w:pPr>
-      <w:r>
-        <w:t xml:space="preserve">Stavy</w:t>
-      </w:r>
-    </w:p>
-    <w:p>
-      <w:pPr>
-        <w:pStyle w:val="Compact"/>
+          <w:numId w:val="1014"/>
+        </w:numPr>
+      </w:pPr>
+      <w:r>
+        <w:t xml:space="preserve">Přechody mezi stavy</w:t>
+      </w:r>
+    </w:p>
+    <w:p>
+      <w:pPr>
         <w:numPr>
           <w:ilvl w:val="2"/>
           <w:numId w:val="1016"/>
         </w:numPr>
       </w:pPr>
       <w:r>
+        <w:t xml:space="preserve">Založení požadavku: Nový</w:t>
+      </w:r>
+    </w:p>
+    <w:p>
+      <w:pPr>
+        <w:numPr>
+          <w:ilvl w:val="2"/>
+          <w:numId w:val="1016"/>
+        </w:numPr>
+      </w:pPr>
+      <w:r>
+        <w:t xml:space="preserve">Přiřazení řešitele: Nový -&gt; Řeší se</w:t>
+      </w:r>
+    </w:p>
+    <w:p>
+      <w:pPr>
+        <w:numPr>
+          <w:ilvl w:val="2"/>
+          <w:numId w:val="1016"/>
+        </w:numPr>
+      </w:pPr>
+      <w:r>
+        <w:t xml:space="preserve">Vyřešení: Řeší se -&gt; Vyřešeno (musí se zadat způsob vyřešení a</w:t>
+      </w:r>
+      <w:r>
+        <w:t xml:space="preserve"> </w:t>
+      </w:r>
+      <w:r>
+        <w:t xml:space="preserve">spotřebovaný čas)</w:t>
+      </w:r>
+    </w:p>
+    <w:p>
+      <w:pPr>
+        <w:numPr>
+          <w:ilvl w:val="2"/>
+          <w:numId w:val="1016"/>
+        </w:numPr>
+      </w:pPr>
+      <w:r>
+        <w:t xml:space="preserve">Zamítnutí: jakýkoliv stav -&gt; Zamítnuto</w:t>
+      </w:r>
+    </w:p>
+    <w:p>
+      <w:pPr>
+        <w:numPr>
+          <w:ilvl w:val="0"/>
+          <w:numId w:val="1013"/>
+        </w:numPr>
+      </w:pPr>
+      <w:r>
+        <w:t xml:space="preserve">Požadavek na vývoj</w:t>
+      </w:r>
+    </w:p>
+    <w:p>
+      <w:pPr>
+        <w:numPr>
+          <w:ilvl w:val="1"/>
+          <w:numId w:val="1017"/>
+        </w:numPr>
+      </w:pPr>
+      <w:r>
+        <w:t xml:space="preserve">Fakturovaný požadavek</w:t>
+      </w:r>
+    </w:p>
+    <w:p>
+      <w:pPr>
+        <w:numPr>
+          <w:ilvl w:val="1"/>
+          <w:numId w:val="1017"/>
+        </w:numPr>
+      </w:pPr>
+      <w:r>
+        <w:t xml:space="preserve">Může k němu být přiřazen Obchodník, pokud je potřeba</w:t>
+      </w:r>
+    </w:p>
+    <w:p>
+      <w:pPr>
+        <w:numPr>
+          <w:ilvl w:val="1"/>
+          <w:numId w:val="1017"/>
+        </w:numPr>
+      </w:pPr>
+      <w:r>
+        <w:t xml:space="preserve">Stavy</w:t>
+      </w:r>
+    </w:p>
+    <w:p>
+      <w:pPr>
+        <w:pStyle w:val="Compact"/>
+        <w:numPr>
+          <w:ilvl w:val="2"/>
+          <w:numId w:val="1018"/>
+        </w:numPr>
+      </w:pPr>
+      <w:r>
         <w:t xml:space="preserve">Nový, Příprava nabídky, Řeší se, Vyřešeno, Zamítnuto</w:t>
       </w:r>
     </w:p>
@@ -3307,7 +4101,7 @@
       <w:pPr>
         <w:numPr>
           <w:ilvl w:val="1"/>
-          <w:numId w:val="1015"/>
+          <w:numId w:val="1017"/>
         </w:numPr>
       </w:pPr>
       <w:r>
@@ -3316,113 +4110,113 @@
     </w:p>
     <w:p>
       <w:pPr>
-        <w:numPr>
-          <w:ilvl w:val="2"/>
-          <w:numId w:val="1017"/>
-        </w:numPr>
-      </w:pPr>
-      <w:r>
-        <w:t xml:space="preserve">Založení požadavku: Nový</w:t>
-      </w:r>
-    </w:p>
-    <w:p>
-      <w:pPr>
-        <w:numPr>
-          <w:ilvl w:val="2"/>
-          <w:numId w:val="1017"/>
-        </w:numPr>
-      </w:pPr>
-      <w:r>
-        <w:t xml:space="preserve">Přiřazení obchodníka: Nový -&gt; Příprava nabídky</w:t>
-      </w:r>
-    </w:p>
-    <w:p>
-      <w:pPr>
-        <w:numPr>
-          <w:ilvl w:val="2"/>
-          <w:numId w:val="1017"/>
-        </w:numPr>
-      </w:pPr>
-      <w:r>
-        <w:t xml:space="preserve">Přiřazení řešitele: Nový nebo Příprava nabídky -&gt; Řeší se</w:t>
-      </w:r>
-    </w:p>
-    <w:p>
-      <w:pPr>
-        <w:numPr>
-          <w:ilvl w:val="2"/>
-          <w:numId w:val="1017"/>
-        </w:numPr>
-      </w:pPr>
-      <w:r>
-        <w:t xml:space="preserve">Vyřešení: Řeší se -&gt; Vyřešeno (musí se zadat způsob vyřešení a</w:t>
-      </w:r>
-      <w:r>
-        <w:t xml:space="preserve"> </w:t>
-      </w:r>
-      <w:r>
-        <w:t xml:space="preserve">spotřebovaný čas)</w:t>
-      </w:r>
-    </w:p>
-    <w:p>
-      <w:pPr>
-        <w:numPr>
-          <w:ilvl w:val="2"/>
-          <w:numId w:val="1017"/>
-        </w:numPr>
-      </w:pPr>
-      <w:r>
-        <w:t xml:space="preserve">Zamítnutí: jakýkoliv stav -&gt; Zamítnuto</w:t>
-      </w:r>
-    </w:p>
-    <w:p>
-      <w:pPr>
-        <w:numPr>
-          <w:ilvl w:val="0"/>
-          <w:numId w:val="1011"/>
-        </w:numPr>
-      </w:pPr>
-      <w:r>
-        <w:t xml:space="preserve">Námět na zlepšení</w:t>
-      </w:r>
-    </w:p>
-    <w:p>
-      <w:pPr>
-        <w:numPr>
-          <w:ilvl w:val="1"/>
-          <w:numId w:val="1018"/>
-        </w:numPr>
-      </w:pPr>
-      <w:r>
-        <w:t xml:space="preserve">Odkladiště nápadů, je potřeba jej změnit na jeden z předchozích typů,</w:t>
-      </w:r>
-      <w:r>
-        <w:t xml:space="preserve"> </w:t>
-      </w:r>
-      <w:r>
-        <w:t xml:space="preserve">aby bylo možné jej vyřešit</w:t>
-      </w:r>
-    </w:p>
-    <w:p>
-      <w:pPr>
-        <w:numPr>
-          <w:ilvl w:val="1"/>
-          <w:numId w:val="1018"/>
-        </w:numPr>
-      </w:pPr>
-      <w:r>
-        <w:t xml:space="preserve">Stavy</w:t>
-      </w:r>
-    </w:p>
-    <w:p>
-      <w:pPr>
-        <w:pStyle w:val="Compact"/>
         <w:numPr>
           <w:ilvl w:val="2"/>
           <w:numId w:val="1019"/>
         </w:numPr>
       </w:pPr>
       <w:r>
+        <w:t xml:space="preserve">Založení požadavku: Nový</w:t>
+      </w:r>
+    </w:p>
+    <w:p>
+      <w:pPr>
+        <w:numPr>
+          <w:ilvl w:val="2"/>
+          <w:numId w:val="1019"/>
+        </w:numPr>
+      </w:pPr>
+      <w:r>
+        <w:t xml:space="preserve">Přiřazení obchodníka: Nový -&gt; Příprava nabídky</w:t>
+      </w:r>
+    </w:p>
+    <w:p>
+      <w:pPr>
+        <w:numPr>
+          <w:ilvl w:val="2"/>
+          <w:numId w:val="1019"/>
+        </w:numPr>
+      </w:pPr>
+      <w:r>
+        <w:t xml:space="preserve">Přiřazení řešitele: Nový nebo Příprava nabídky -&gt; Řeší se</w:t>
+      </w:r>
+    </w:p>
+    <w:p>
+      <w:pPr>
+        <w:numPr>
+          <w:ilvl w:val="2"/>
+          <w:numId w:val="1019"/>
+        </w:numPr>
+      </w:pPr>
+      <w:r>
+        <w:t xml:space="preserve">Vyřešení: Řeší se -&gt; Vyřešeno (musí se zadat způsob vyřešení a</w:t>
+      </w:r>
+      <w:r>
+        <w:t xml:space="preserve"> </w:t>
+      </w:r>
+      <w:r>
+        <w:t xml:space="preserve">spotřebovaný čas)</w:t>
+      </w:r>
+    </w:p>
+    <w:p>
+      <w:pPr>
+        <w:numPr>
+          <w:ilvl w:val="2"/>
+          <w:numId w:val="1019"/>
+        </w:numPr>
+      </w:pPr>
+      <w:r>
+        <w:t xml:space="preserve">Zamítnutí: jakýkoliv stav -&gt; Zamítnuto</w:t>
+      </w:r>
+    </w:p>
+    <w:p>
+      <w:pPr>
+        <w:numPr>
+          <w:ilvl w:val="0"/>
+          <w:numId w:val="1013"/>
+        </w:numPr>
+      </w:pPr>
+      <w:r>
+        <w:t xml:space="preserve">Námět na zlepšení</w:t>
+      </w:r>
+    </w:p>
+    <w:p>
+      <w:pPr>
+        <w:numPr>
+          <w:ilvl w:val="1"/>
+          <w:numId w:val="1020"/>
+        </w:numPr>
+      </w:pPr>
+      <w:r>
+        <w:t xml:space="preserve">Odkladiště nápadů, je potřeba jej změnit na jeden z předchozích typů,</w:t>
+      </w:r>
+      <w:r>
+        <w:t xml:space="preserve"> </w:t>
+      </w:r>
+      <w:r>
+        <w:t xml:space="preserve">aby bylo možné jej vyřešit</w:t>
+      </w:r>
+    </w:p>
+    <w:p>
+      <w:pPr>
+        <w:numPr>
+          <w:ilvl w:val="1"/>
+          <w:numId w:val="1020"/>
+        </w:numPr>
+      </w:pPr>
+      <w:r>
+        <w:t xml:space="preserve">Stavy</w:t>
+      </w:r>
+    </w:p>
+    <w:p>
+      <w:pPr>
+        <w:pStyle w:val="Compact"/>
+        <w:numPr>
+          <w:ilvl w:val="2"/>
+          <w:numId w:val="1021"/>
+        </w:numPr>
+      </w:pPr>
+      <w:r>
         <w:t xml:space="preserve">Nový, Zamítnuto</w:t>
       </w:r>
     </w:p>
@@ -3430,7 +4224,7 @@
       <w:pPr>
         <w:numPr>
           <w:ilvl w:val="1"/>
-          <w:numId w:val="1018"/>
+          <w:numId w:val="1020"/>
         </w:numPr>
       </w:pPr>
       <w:r>
@@ -3441,7 +4235,7 @@
       <w:pPr>
         <w:numPr>
           <w:ilvl w:val="2"/>
-          <w:numId w:val="1020"/>
+          <w:numId w:val="1022"/>
         </w:numPr>
       </w:pPr>
       <w:r>
@@ -3452,7 +4246,7 @@
       <w:pPr>
         <w:numPr>
           <w:ilvl w:val="2"/>
-          <w:numId w:val="1020"/>
+          <w:numId w:val="1022"/>
         </w:numPr>
       </w:pPr>
       <w:r>
@@ -3498,10 +4292,23 @@
         <w:t xml:space="preserve"> </w:t>
       </w:r>
       <w:r>
-        <w:t xml:space="preserve">do stavu „Řeší se” nebo „Příprava nabídky”.</w:t>
-      </w:r>
-    </w:p>
-    <w:bookmarkStart w:id="11" w:name="přílohy"/>
+        <w:t xml:space="preserve">do stavu „Řeší se” nebo „Příprava nabídky”. Při znovuotevření se způsob</w:t>
+      </w:r>
+      <w:r>
+        <w:t xml:space="preserve"> </w:t>
+      </w:r>
+      <w:r>
+        <w:t xml:space="preserve">vyřešení nebo důvod zamítnutí automaticky přepíše do komentáře (autorem</w:t>
+      </w:r>
+      <w:r>
+        <w:t xml:space="preserve"> </w:t>
+      </w:r>
+      <w:r>
+        <w:t xml:space="preserve">komentáře je správce provádějící akci) a pole se vymažou.</w:t>
+      </w:r>
+    </w:p>
+    <w:bookmarkEnd w:id="12"/>
+    <w:bookmarkStart w:id="13" w:name="přílohy"/>
     <w:p>
       <w:pPr>
         <w:pStyle w:val="Heading3"/>
@@ -3534,8 +4341,8 @@
         <w:t xml:space="preserve">Soubory jsou dostupné ke stažení pouze přihlášeným uživatelům s přístupem k danému požadavku — přímý přístup přes URL je zakázán.</w:t>
       </w:r>
     </w:p>
-    <w:bookmarkEnd w:id="11"/>
-    <w:bookmarkStart w:id="12" w:name="historie-změn"/>
+    <w:bookmarkEnd w:id="13"/>
+    <w:bookmarkStart w:id="14" w:name="historie-změn"/>
     <w:p>
       <w:pPr>
         <w:pStyle w:val="Heading3"/>
@@ -3557,7 +4364,7 @@
         <w:pStyle w:val="Compact"/>
         <w:numPr>
           <w:ilvl w:val="0"/>
-          <w:numId w:val="1021"/>
+          <w:numId w:val="1023"/>
         </w:numPr>
       </w:pPr>
       <w:r>
@@ -3569,7 +4376,7 @@
         <w:pStyle w:val="Compact"/>
         <w:numPr>
           <w:ilvl w:val="0"/>
-          <w:numId w:val="1021"/>
+          <w:numId w:val="1023"/>
         </w:numPr>
       </w:pPr>
       <w:r>
@@ -3581,7 +4388,7 @@
         <w:pStyle w:val="Compact"/>
         <w:numPr>
           <w:ilvl w:val="0"/>
-          <w:numId w:val="1021"/>
+          <w:numId w:val="1023"/>
         </w:numPr>
       </w:pPr>
       <w:r>
@@ -3593,7 +4400,7 @@
         <w:pStyle w:val="Compact"/>
         <w:numPr>
           <w:ilvl w:val="0"/>
-          <w:numId w:val="1021"/>
+          <w:numId w:val="1023"/>
         </w:numPr>
       </w:pPr>
       <w:r>
@@ -3605,7 +4412,7 @@
         <w:pStyle w:val="Compact"/>
         <w:numPr>
           <w:ilvl w:val="0"/>
-          <w:numId w:val="1021"/>
+          <w:numId w:val="1023"/>
         </w:numPr>
       </w:pPr>
       <w:r>
@@ -3628,8 +4435,8 @@
         <w:t xml:space="preserve">Historie změn je viditelná všem uživatelům s přístupem k danému požadavku, s výjimkou interních záznamů (záznamy hodin), které žadatel nevidí.</w:t>
       </w:r>
     </w:p>
-    <w:bookmarkEnd w:id="12"/>
-    <w:bookmarkStart w:id="13" w:name="zápis-času"/>
+    <w:bookmarkEnd w:id="14"/>
+    <w:bookmarkStart w:id="15" w:name="zápis-času"/>
     <w:p>
       <w:pPr>
         <w:pStyle w:val="Heading3"/>
@@ -3678,8 +4485,90 @@
         <w:t xml:space="preserve">volitelné.</w:t>
       </w:r>
     </w:p>
-    <w:bookmarkEnd w:id="13"/>
-    <w:bookmarkStart w:id="14" w:name="notifikace"/>
+    <w:bookmarkEnd w:id="15"/>
+    <w:bookmarkStart w:id="16" w:name="kategorie-práce"/>
+    <w:p>
+      <w:pPr>
+        <w:pStyle w:val="Heading3"/>
+      </w:pPr>
+      <w:r>
+        <w:t xml:space="preserve">Kategorie práce</w:t>
+      </w:r>
+    </w:p>
+    <w:p>
+      <w:pPr>
+        <w:pStyle w:val="FirstParagraph"/>
+      </w:pPr>
+      <w:r>
+        <w:t xml:space="preserve">Každý tiket může mít přiřazenu interní kategorii práce (např. instalace</w:t>
+      </w:r>
+      <w:r>
+        <w:t xml:space="preserve"> </w:t>
+      </w:r>
+      <w:r>
+        <w:t xml:space="preserve">kabeláže, vývoj, implementace, analýza, konfigurace HW). Kategorie je</w:t>
+      </w:r>
+      <w:r>
+        <w:t xml:space="preserve"> </w:t>
+      </w:r>
+      <w:r>
+        <w:t xml:space="preserve">interní — žadatel ji nevidí ani v detailu, ani v přehledu.</w:t>
+      </w:r>
+    </w:p>
+    <w:p>
+      <w:pPr>
+        <w:pStyle w:val="BodyText"/>
+      </w:pPr>
+      <w:r>
+        <w:t xml:space="preserve">Kategorii může nastavit přiřazený řešitel nebo správce (v rámci svého</w:t>
+      </w:r>
+      <w:r>
+        <w:t xml:space="preserve"> </w:t>
+      </w:r>
+      <w:r>
+        <w:t xml:space="preserve">omezení). Kategorie jsou vázány na oblasti — při editaci tiketu se</w:t>
+      </w:r>
+      <w:r>
+        <w:t xml:space="preserve"> </w:t>
+      </w:r>
+      <w:r>
+        <w:t xml:space="preserve">zobrazí pouze kategorie přiřazené k oblasti daného tiketu; pokud oblast</w:t>
+      </w:r>
+      <w:r>
+        <w:t xml:space="preserve"> </w:t>
+      </w:r>
+      <w:r>
+        <w:t xml:space="preserve">tiketu nemá přiřazeny žádné kategorie, zobrazí se všechny.</w:t>
+      </w:r>
+    </w:p>
+    <w:p>
+      <w:pPr>
+        <w:pStyle w:val="BodyText"/>
+      </w:pPr>
+      <w:r>
+        <w:t xml:space="preserve">Správa kategorií (přidávání, úprava) je dostupná pouze administrátorovi</w:t>
+      </w:r>
+      <w:r>
+        <w:t xml:space="preserve"> </w:t>
+      </w:r>
+      <w:r>
+        <w:t xml:space="preserve">přes webové rozhraní. Každá kategorie má název a seznam oblastí, ke</w:t>
+      </w:r>
+      <w:r>
+        <w:t xml:space="preserve"> </w:t>
+      </w:r>
+      <w:r>
+        <w:t xml:space="preserve">kterým patří. Administrátor může přiřadit kategorie oblasti také přímo</w:t>
+      </w:r>
+      <w:r>
+        <w:t xml:space="preserve"> </w:t>
+      </w:r>
+      <w:r>
+        <w:t xml:space="preserve">z formuláře editace oblasti.</w:t>
+      </w:r>
+    </w:p>
+    <w:bookmarkEnd w:id="16"/>
+    <w:bookmarkStart w:id="17" w:name="notifikace"/>
     <w:p>
       <w:pPr>
         <w:pStyle w:val="Heading3"/>
@@ -4018,6 +4907,41 @@
           </w:p>
         </w:tc>
       </w:tr>
+      <w:tr>
+        <w:tc>
+          <w:tcPr/>
+          <w:p>
+            <w:pPr>
+              <w:pStyle w:val="Compact"/>
+            </w:pPr>
+            <w:r>
+              <w:t xml:space="preserve">Výzva k hodnocení po vyřešení</w:t>
+            </w:r>
+          </w:p>
+        </w:tc>
+        <w:tc>
+          <w:tcPr/>
+          <w:p>
+            <w:pPr>
+              <w:pStyle w:val="Compact"/>
+            </w:pPr>
+            <w:r>
+              <w:t xml:space="preserve">Žadatel (samostatný e-mail)</w:t>
+            </w:r>
+          </w:p>
+        </w:tc>
+        <w:tc>
+          <w:tcPr/>
+          <w:p>
+            <w:pPr>
+              <w:pStyle w:val="Compact"/>
+            </w:pPr>
+            <w:r>
+              <w:t xml:space="preserve">Klikatelné hvězdičky 0–5 s jednorázovými odkazy</w:t>
+            </w:r>
+          </w:p>
+        </w:tc>
+      </w:tr>
     </w:tbl>
     <w:p>
       <w:pPr>
@@ -4048,7 +4972,7 @@
         <w:pStyle w:val="Compact"/>
         <w:numPr>
           <w:ilvl w:val="0"/>
-          <w:numId w:val="1022"/>
+          <w:numId w:val="1024"/>
         </w:numPr>
       </w:pPr>
       <w:r>
@@ -4060,7 +4984,7 @@
         <w:pStyle w:val="Compact"/>
         <w:numPr>
           <w:ilvl w:val="0"/>
-          <w:numId w:val="1022"/>
+          <w:numId w:val="1024"/>
         </w:numPr>
       </w:pPr>
       <w:r>
@@ -4084,7 +5008,7 @@
         <w:pStyle w:val="Compact"/>
         <w:numPr>
           <w:ilvl w:val="0"/>
-          <w:numId w:val="1022"/>
+          <w:numId w:val="1024"/>
         </w:numPr>
       </w:pPr>
       <w:r>
@@ -4102,7 +5026,7 @@
         <w:pStyle w:val="Compact"/>
         <w:numPr>
           <w:ilvl w:val="0"/>
-          <w:numId w:val="1022"/>
+          <w:numId w:val="1024"/>
         </w:numPr>
       </w:pPr>
       <w:r>
@@ -4115,15 +5039,14 @@
         <w:t xml:space="preserve">z oblastí i jednu z firem.</w:t>
       </w:r>
     </w:p>
-    <w:bookmarkEnd w:id="14"/>
-    <w:bookmarkEnd w:id="15"/>
-    <w:bookmarkStart w:id="19" w:name="přehled-požadavků"/>
-    <w:p>
-      <w:pPr>
-        <w:pStyle w:val="Heading2"/>
-      </w:pPr>
-      <w:r>
-        <w:t xml:space="preserve">Přehled požadavků</w:t>
+    <w:bookmarkEnd w:id="17"/>
+    <w:bookmarkStart w:id="18" w:name="hodnocení-spokojenosti"/>
+    <w:p>
+      <w:pPr>
+        <w:pStyle w:val="Heading3"/>
+      </w:pPr>
+      <w:r>
+        <w:t xml:space="preserve">Hodnocení spokojenosti</w:t>
       </w:r>
     </w:p>
     <w:p>
@@ -4131,7 +5054,43 @@
         <w:pStyle w:val="FirstParagraph"/>
       </w:pPr>
       <w:r>
-        <w:t xml:space="preserve">Každý uživatel vidí pouze požadavky, ke kterým má přístup (viz role).</w:t>
+        <w:t xml:space="preserve">Po vyřešení tiketu obdrží žadatel samostatný e-mail s výzvou k hodnocení.</w:t>
+      </w:r>
+      <w:r>
+        <w:t xml:space="preserve"> </w:t>
+      </w:r>
+      <w:r>
+        <w:t xml:space="preserve">E-mail obsahuje klikatelné hvězdičky (0–5), každá hvězdička je jednorázový</w:t>
+      </w:r>
+      <w:r>
+        <w:t xml:space="preserve"> </w:t>
+      </w:r>
+      <w:r>
+        <w:t xml:space="preserve">odkaz — kliknutím se hodnocení okamžitě uloží bez nutnosti přihlášení.</w:t>
+      </w:r>
+      <w:r>
+        <w:t xml:space="preserve"> </w:t>
+      </w:r>
+      <w:r>
+        <w:t xml:space="preserve">Po kliknutí se zobrazí stránka s potvrzením hodnocení a volitelným polem</w:t>
+      </w:r>
+      <w:r>
+        <w:t xml:space="preserve"> </w:t>
+      </w:r>
+      <w:r>
+        <w:t xml:space="preserve">pro textový komentář (nepovinný, max. 2 000 znaků). Komentář se odesílá</w:t>
+      </w:r>
+      <w:r>
+        <w:t xml:space="preserve"> </w:t>
+      </w:r>
+      <w:r>
+        <w:t xml:space="preserve">samostatným tlačítkem a je zabezpečen vlastním jednorázovým tokenem.</w:t>
+      </w:r>
+      <w:r>
+        <w:t xml:space="preserve"> </w:t>
+      </w:r>
+      <w:r>
+        <w:t xml:space="preserve">Pokud žadatel stránku zavře bez odeslání komentáře, hodnocení zůstane uloženo.</w:t>
       </w:r>
     </w:p>
     <w:p>
@@ -4139,28 +5098,97 @@
         <w:pStyle w:val="BodyText"/>
       </w:pPr>
       <w:r>
-        <w:t xml:space="preserve">Přehled obsahuje sloupce: #, Název, Typ, Stav, Priorita, Firma, Vytvořeno.</w:t>
-      </w:r>
-      <w:r>
-        <w:t xml:space="preserve"> </w:t>
-      </w:r>
-      <w:r>
-        <w:t xml:space="preserve">Správce navíc vidí sloupec Řešitel. Řešitel, obchodník a správce vidí</w:t>
-      </w:r>
-      <w:r>
-        <w:t xml:space="preserve"> </w:t>
-      </w:r>
-      <w:r>
-        <w:t xml:space="preserve">sloupec Hodiny (součet všech zaznamenaných hodin k danému požadavku).</w:t>
-      </w:r>
-    </w:p>
-    <w:bookmarkStart w:id="16" w:name="filtry"/>
-    <w:p>
-      <w:pPr>
-        <w:pStyle w:val="Heading3"/>
-      </w:pPr>
-      <w:r>
-        <w:t xml:space="preserve">Filtry</w:t>
+        <w:t xml:space="preserve">Pravidla hodnocení:</w:t>
+      </w:r>
+    </w:p>
+    <w:p>
+      <w:pPr>
+        <w:pStyle w:val="Compact"/>
+        <w:numPr>
+          <w:ilvl w:val="0"/>
+          <w:numId w:val="1025"/>
+        </w:numPr>
+      </w:pPr>
+      <w:r>
+        <w:t xml:space="preserve">Hodnotit lze pouze tikety ve stavu „Vyřešeno” (nikoliv „Zamítnuto”).</w:t>
+      </w:r>
+    </w:p>
+    <w:p>
+      <w:pPr>
+        <w:pStyle w:val="Compact"/>
+        <w:numPr>
+          <w:ilvl w:val="0"/>
+          <w:numId w:val="1025"/>
+        </w:numPr>
+      </w:pPr>
+      <w:r>
+        <w:t xml:space="preserve">Každý tiket lze hodnotit právě jednou — odkaz je po použití neplatný.</w:t>
+      </w:r>
+    </w:p>
+    <w:p>
+      <w:pPr>
+        <w:pStyle w:val="Compact"/>
+        <w:numPr>
+          <w:ilvl w:val="0"/>
+          <w:numId w:val="1025"/>
+        </w:numPr>
+      </w:pPr>
+      <w:r>
+        <w:t xml:space="preserve">Komentář k hodnocení lze přidat právě jednou (druhý token je po odeslání zneplatněn).</w:t>
+      </w:r>
+    </w:p>
+    <w:p>
+      <w:pPr>
+        <w:pStyle w:val="Compact"/>
+        <w:numPr>
+          <w:ilvl w:val="0"/>
+          <w:numId w:val="1025"/>
+        </w:numPr>
+      </w:pPr>
+      <w:r>
+        <w:t xml:space="preserve">Při znovuotevření tiketu se hodnocení i komentář resetují; po novém vyřešení</w:t>
+      </w:r>
+      <w:r>
+        <w:t xml:space="preserve"> </w:t>
+      </w:r>
+      <w:r>
+        <w:t xml:space="preserve">přijde žadateli nová výzva.</w:t>
+      </w:r>
+    </w:p>
+    <w:p>
+      <w:pPr>
+        <w:pStyle w:val="Compact"/>
+        <w:numPr>
+          <w:ilvl w:val="0"/>
+          <w:numId w:val="1025"/>
+        </w:numPr>
+      </w:pPr>
+      <w:r>
+        <w:t xml:space="preserve">Hodnotící e-mail je odesílán výhradně žadateli tiketu, bez ohledu</w:t>
+      </w:r>
+      <w:r>
+        <w:t xml:space="preserve"> </w:t>
+      </w:r>
+      <w:r>
+        <w:t xml:space="preserve">na případné další příjemce uzavíracích notifikací.</w:t>
+      </w:r>
+    </w:p>
+    <w:p>
+      <w:pPr>
+        <w:pStyle w:val="Compact"/>
+        <w:numPr>
+          <w:ilvl w:val="0"/>
+          <w:numId w:val="1025"/>
+        </w:numPr>
+      </w:pPr>
+      <w:r>
+        <w:t xml:space="preserve">Odkaz je zabezpečen jednorázovým UUID tokenem; neplatný nebo již</w:t>
+      </w:r>
+      <w:r>
+        <w:t xml:space="preserve"> </w:t>
+      </w:r>
+      <w:r>
+        <w:t xml:space="preserve">použitý odkaz zobrazí srozumitelnou chybovou stránku.</w:t>
       </w:r>
     </w:p>
     <w:p>
@@ -4168,150 +5196,256 @@
         <w:pStyle w:val="FirstParagraph"/>
       </w:pPr>
       <w:r>
-        <w:t xml:space="preserve">Všichni uživatelé mohou filtrovat podle: Stav, Typ, Oblast, Priorita,</w:t>
-      </w:r>
-      <w:r>
-        <w:t xml:space="preserve"> </w:t>
-      </w:r>
-      <w:r>
-        <w:t xml:space="preserve">a textového vyhledávání v názvu a popisu.</w:t>
-      </w:r>
-    </w:p>
-    <w:p>
-      <w:pPr>
-        <w:pStyle w:val="BodyText"/>
-      </w:pPr>
-      <w:r>
-        <w:t xml:space="preserve">Filtr data vytvoření funguje jako rozsah: pole „Vytvořeno od” omezuje</w:t>
-      </w:r>
-      <w:r>
-        <w:t xml:space="preserve"> </w:t>
-      </w:r>
-      <w:r>
-        <w:t xml:space="preserve">výsledky na tikety vytvořené v daný den nebo později, pole „Vytvořeno do”</w:t>
-      </w:r>
-      <w:r>
-        <w:t xml:space="preserve"> </w:t>
-      </w:r>
-      <w:r>
-        <w:t xml:space="preserve">na tikety vytvořené v daný den nebo dříve. Obě pole jsou volitelná</w:t>
-      </w:r>
-      <w:r>
-        <w:t xml:space="preserve"> </w:t>
-      </w:r>
-      <w:r>
-        <w:t xml:space="preserve">a nezávislá — lze zadat jen jedno z nich (filtr od, filtr do) nebo obě</w:t>
-      </w:r>
-      <w:r>
-        <w:t xml:space="preserve"> </w:t>
-      </w:r>
-      <w:r>
-        <w:t xml:space="preserve">najednou pro přesný rozsah.</w:t>
-      </w:r>
-    </w:p>
-    <w:p>
-      <w:pPr>
-        <w:pStyle w:val="BodyText"/>
-      </w:pPr>
-      <w:r>
-        <w:t xml:space="preserve">Správce a administrátor mohou navíc filtrovat podle: Firma, Žadatel,</w:t>
-      </w:r>
-      <w:r>
-        <w:t xml:space="preserve"> </w:t>
-      </w:r>
-      <w:r>
-        <w:t xml:space="preserve">Řešitel.</w:t>
-      </w:r>
-    </w:p>
-    <w:bookmarkEnd w:id="16"/>
-    <w:bookmarkStart w:id="17" w:name="export-do-excelu"/>
-    <w:p>
-      <w:pPr>
-        <w:pStyle w:val="Heading3"/>
-      </w:pPr>
-      <w:r>
-        <w:t xml:space="preserve">Export do Excelu</w:t>
-      </w:r>
-    </w:p>
-    <w:p>
-      <w:pPr>
-        <w:pStyle w:val="FirstParagraph"/>
-      </w:pPr>
-      <w:r>
-        <w:t xml:space="preserve">Z přehledu požadavků lze exportovat aktuálně zobrazené tikety (včetně</w:t>
-      </w:r>
-      <w:r>
-        <w:t xml:space="preserve"> </w:t>
-      </w:r>
-      <w:r>
-        <w:t xml:space="preserve">aplikovaných filtrů) do souboru XLSX. Export respektuje stejná pravidla</w:t>
-      </w:r>
-      <w:r>
-        <w:t xml:space="preserve"> </w:t>
-      </w:r>
-      <w:r>
-        <w:t xml:space="preserve">viditelnosti jako přehled — každý uživatel exportuje pouze tikety,</w:t>
-      </w:r>
-      <w:r>
-        <w:t xml:space="preserve"> </w:t>
-      </w:r>
-      <w:r>
-        <w:t xml:space="preserve">ke kterým má přístup.</w:t>
-      </w:r>
-    </w:p>
-    <w:p>
-      <w:pPr>
-        <w:pStyle w:val="BodyText"/>
-      </w:pPr>
-      <w:r>
-        <w:t xml:space="preserve">Sloupce exportu: #, Název, Typ, Stav, Priorita, Oblast, Firma, Žadatel,</w:t>
-      </w:r>
-      <w:r>
-        <w:t xml:space="preserve"> </w:t>
-      </w:r>
-      <w:r>
-        <w:t xml:space="preserve">Vytvořeno. Správce a administrátor mají navíc sloupec Řešitel. Řešitel,</w:t>
-      </w:r>
-      <w:r>
-        <w:t xml:space="preserve"> </w:t>
-      </w:r>
-      <w:r>
-        <w:t xml:space="preserve">obchodník a správce mají navíc sloupec Hodiny.</w:t>
-      </w:r>
-    </w:p>
-    <w:bookmarkEnd w:id="17"/>
-    <w:bookmarkStart w:id="18" w:name="navigace-v-detailu-požadavku"/>
-    <w:p>
-      <w:pPr>
-        <w:pStyle w:val="Heading3"/>
-      </w:pPr>
-      <w:r>
-        <w:t xml:space="preserve">Navigace v detailu požadavku</w:t>
-      </w:r>
-    </w:p>
-    <w:p>
-      <w:pPr>
-        <w:pStyle w:val="FirstParagraph"/>
-      </w:pPr>
-      <w:r>
-        <w:t xml:space="preserve">V detailu požadavku jsou zobrazeny šipky pro přechod na předchozí a</w:t>
-      </w:r>
-      <w:r>
-        <w:t xml:space="preserve"> </w:t>
-      </w:r>
-      <w:r>
-        <w:t xml:space="preserve">následující požadavek. Pořadí odpovídá pořadí v přehledu (dle PK).</w:t>
-      </w:r>
-      <w:r>
-        <w:t xml:space="preserve"> </w:t>
-      </w:r>
-      <w:r>
-        <w:t xml:space="preserve">Uživatel může přejít pouze na požadavek, ke kterému má přístup.</w:t>
+        <w:t xml:space="preserve">Hodnocení a komentář jsou viditelné v detailu tiketu (sidebar) a hodnocení</w:t>
+      </w:r>
+      <w:r>
+        <w:t xml:space="preserve"> </w:t>
+      </w:r>
+      <w:r>
+        <w:t xml:space="preserve">ve statistikách:</w:t>
+      </w:r>
+    </w:p>
+    <w:p>
+      <w:pPr>
+        <w:pStyle w:val="Compact"/>
+        <w:numPr>
+          <w:ilvl w:val="0"/>
+          <w:numId w:val="1026"/>
+        </w:numPr>
+      </w:pPr>
+      <w:r>
+        <w:rPr>
+          <w:b/>
+          <w:bCs/>
+        </w:rPr>
+        <w:t xml:space="preserve">Řešitel</w:t>
+      </w:r>
+      <w:r>
+        <w:t xml:space="preserve"> </w:t>
+      </w:r>
+      <w:r>
+        <w:t xml:space="preserve">vidí své průměrné hodnocení za zvolený měsíc.</w:t>
+      </w:r>
+    </w:p>
+    <w:p>
+      <w:pPr>
+        <w:pStyle w:val="Compact"/>
+        <w:numPr>
+          <w:ilvl w:val="0"/>
+          <w:numId w:val="1026"/>
+        </w:numPr>
+      </w:pPr>
+      <w:r>
+        <w:rPr>
+          <w:b/>
+          <w:bCs/>
+        </w:rPr>
+        <w:t xml:space="preserve">Správce</w:t>
+      </w:r>
+      <w:r>
+        <w:t xml:space="preserve"> </w:t>
+      </w:r>
+      <w:r>
+        <w:t xml:space="preserve">vidí průměrné hodnocení každého řešitele za zvolený měsíc.</w:t>
       </w:r>
     </w:p>
     <w:bookmarkEnd w:id="18"/>
     <w:bookmarkEnd w:id="19"/>
+    <w:bookmarkStart w:id="23" w:name="přehled-požadavků"/>
+    <w:p>
+      <w:pPr>
+        <w:pStyle w:val="Heading2"/>
+      </w:pPr>
+      <w:r>
+        <w:t xml:space="preserve">Přehled požadavků</w:t>
+      </w:r>
+    </w:p>
+    <w:p>
+      <w:pPr>
+        <w:pStyle w:val="FirstParagraph"/>
+      </w:pPr>
+      <w:r>
+        <w:t xml:space="preserve">Každý uživatel vidí pouze požadavky, ke kterým má přístup (viz role).</w:t>
+      </w:r>
+    </w:p>
+    <w:p>
+      <w:pPr>
+        <w:pStyle w:val="BodyText"/>
+      </w:pPr>
+      <w:r>
+        <w:t xml:space="preserve">Přehled obsahuje sloupce: #, Název, Typ, Stav, Priorita, Firma, Vytvořeno.</w:t>
+      </w:r>
+      <w:r>
+        <w:t xml:space="preserve"> </w:t>
+      </w:r>
+      <w:r>
+        <w:t xml:space="preserve">Správce navíc vidí sloupec Řešitel. Řešitel, obchodník a správce vidí</w:t>
+      </w:r>
+      <w:r>
+        <w:t xml:space="preserve"> </w:t>
+      </w:r>
+      <w:r>
+        <w:t xml:space="preserve">sloupec Hodiny (součet všech zaznamenaných hodin k danému požadavku).</w:t>
+      </w:r>
+    </w:p>
+    <w:bookmarkStart w:id="20" w:name="filtry"/>
+    <w:p>
+      <w:pPr>
+        <w:pStyle w:val="Heading3"/>
+      </w:pPr>
+      <w:r>
+        <w:t xml:space="preserve">Filtry</w:t>
+      </w:r>
+    </w:p>
+    <w:p>
+      <w:pPr>
+        <w:pStyle w:val="FirstParagraph"/>
+      </w:pPr>
+      <w:r>
+        <w:t xml:space="preserve">Všichni uživatelé mohou filtrovat podle: Stav, Typ, Oblast, Priorita,</w:t>
+      </w:r>
+      <w:r>
+        <w:t xml:space="preserve"> </w:t>
+      </w:r>
+      <w:r>
+        <w:t xml:space="preserve">a textového vyhledávání v názvu a popisu.</w:t>
+      </w:r>
+    </w:p>
+    <w:p>
+      <w:pPr>
+        <w:pStyle w:val="BodyText"/>
+      </w:pPr>
+      <w:r>
+        <w:t xml:space="preserve">Filtr data vytvoření funguje jako rozsah: pole „Vytvořeno od” omezuje</w:t>
+      </w:r>
+      <w:r>
+        <w:t xml:space="preserve"> </w:t>
+      </w:r>
+      <w:r>
+        <w:t xml:space="preserve">výsledky na tikety vytvořené v daný den nebo později, pole „Vytvořeno do”</w:t>
+      </w:r>
+      <w:r>
+        <w:t xml:space="preserve"> </w:t>
+      </w:r>
+      <w:r>
+        <w:t xml:space="preserve">na tikety vytvořené v daný den nebo dříve. Obě pole jsou volitelná</w:t>
+      </w:r>
+      <w:r>
+        <w:t xml:space="preserve"> </w:t>
+      </w:r>
+      <w:r>
+        <w:t xml:space="preserve">a nezávislá — lze zadat jen jedno z nich (filtr od, filtr do) nebo obě</w:t>
+      </w:r>
+      <w:r>
+        <w:t xml:space="preserve"> </w:t>
+      </w:r>
+      <w:r>
+        <w:t xml:space="preserve">najednou pro přesný rozsah.</w:t>
+      </w:r>
+    </w:p>
+    <w:p>
+      <w:pPr>
+        <w:pStyle w:val="BodyText"/>
+      </w:pPr>
+      <w:r>
+        <w:t xml:space="preserve">Správce a administrátor mohou navíc filtrovat podle: Firma, Žadatel,</w:t>
+      </w:r>
+      <w:r>
+        <w:t xml:space="preserve"> </w:t>
+      </w:r>
+      <w:r>
+        <w:t xml:space="preserve">Řešitel.</w:t>
+      </w:r>
+    </w:p>
     <w:bookmarkEnd w:id="20"/>
+    <w:bookmarkStart w:id="21" w:name="export-do-excelu"/>
+    <w:p>
+      <w:pPr>
+        <w:pStyle w:val="Heading3"/>
+      </w:pPr>
+      <w:r>
+        <w:t xml:space="preserve">Export do Excelu</w:t>
+      </w:r>
+    </w:p>
+    <w:p>
+      <w:pPr>
+        <w:pStyle w:val="FirstParagraph"/>
+      </w:pPr>
+      <w:r>
+        <w:t xml:space="preserve">Z přehledu požadavků lze exportovat aktuálně zobrazené tikety (včetně</w:t>
+      </w:r>
+      <w:r>
+        <w:t xml:space="preserve"> </w:t>
+      </w:r>
+      <w:r>
+        <w:t xml:space="preserve">aplikovaných filtrů) do souboru XLSX. Export respektuje stejná pravidla</w:t>
+      </w:r>
+      <w:r>
+        <w:t xml:space="preserve"> </w:t>
+      </w:r>
+      <w:r>
+        <w:t xml:space="preserve">viditelnosti jako přehled — každý uživatel exportuje pouze tikety,</w:t>
+      </w:r>
+      <w:r>
+        <w:t xml:space="preserve"> </w:t>
+      </w:r>
+      <w:r>
+        <w:t xml:space="preserve">ke kterým má přístup.</w:t>
+      </w:r>
+    </w:p>
+    <w:p>
+      <w:pPr>
+        <w:pStyle w:val="BodyText"/>
+      </w:pPr>
+      <w:r>
+        <w:t xml:space="preserve">Sloupce exportu: #, Název, Typ, Stav, Priorita, Oblast, Firma, Žadatel,</w:t>
+      </w:r>
+      <w:r>
+        <w:t xml:space="preserve"> </w:t>
+      </w:r>
+      <w:r>
+        <w:t xml:space="preserve">Vytvořeno. Správce a administrátor mají navíc sloupec Řešitel. Řešitel,</w:t>
+      </w:r>
+      <w:r>
+        <w:t xml:space="preserve"> </w:t>
+      </w:r>
+      <w:r>
+        <w:t xml:space="preserve">obchodník a správce mají navíc sloupec Hodiny.</w:t>
+      </w:r>
+    </w:p>
+    <w:bookmarkEnd w:id="21"/>
+    <w:bookmarkStart w:id="22" w:name="navigace-v-detailu-požadavku"/>
+    <w:p>
+      <w:pPr>
+        <w:pStyle w:val="Heading3"/>
+      </w:pPr>
+      <w:r>
+        <w:t xml:space="preserve">Navigace v detailu požadavku</w:t>
+      </w:r>
+    </w:p>
+    <w:p>
+      <w:pPr>
+        <w:pStyle w:val="FirstParagraph"/>
+      </w:pPr>
+      <w:r>
+        <w:t xml:space="preserve">V detailu požadavku jsou zobrazeny šipky pro přechod na předchozí a</w:t>
+      </w:r>
+      <w:r>
+        <w:t xml:space="preserve"> </w:t>
+      </w:r>
+      <w:r>
+        <w:t xml:space="preserve">následující požadavek. Pořadí odpovídá pořadí v přehledu (dle PK).</w:t>
+      </w:r>
+      <w:r>
+        <w:t xml:space="preserve"> </w:t>
+      </w:r>
+      <w:r>
+        <w:t xml:space="preserve">Uživatel může přejít pouze na požadavek, ke kterému má přístup.</w:t>
+      </w:r>
+    </w:p>
+    <w:bookmarkEnd w:id="22"/>
+    <w:bookmarkEnd w:id="23"/>
+    <w:bookmarkEnd w:id="24"/>
     <w:sectPr>
       <w:footnotePr>
         <w:numRestart w:val="eachSect"/>
@@ -4592,6 +5726,18 @@
     <w:abstractNumId w:val="991"/>
   </w:num>
   <w:num w:numId="1022">
+    <w:abstractNumId w:val="991"/>
+  </w:num>
+  <w:num w:numId="1023">
+    <w:abstractNumId w:val="991"/>
+  </w:num>
+  <w:num w:numId="1024">
+    <w:abstractNumId w:val="991"/>
+  </w:num>
+  <w:num w:numId="1025">
+    <w:abstractNumId w:val="991"/>
+  </w:num>
+  <w:num w:numId="1026">
     <w:abstractNumId w:val="991"/>
   </w:num>
 </w:numbering>

</xml_diff>